<commit_message>
docs: add full working operational flow screenshots with zero loading marks and admin approved/rejected views to user manual and usermanual.docx
</commit_message>
<xml_diff>
--- a/docx/usermanual.docx
+++ b/docx/usermanual.docx
@@ -40,7 +40,7 @@
           <w:color w:val="1E293B"/>
           <w:sz w:val="24"/>
         </w:rPr>
-        <w:t>Complete Step-by-Step Operating Handbook &amp; Visual Interface Guide for Farmers, Wholesalers, Logistics Drivers, Direct Consumers, and System Administrators.</w:t>
+        <w:t>Complete End-to-End Operating Handbook &amp; Working Lifecycle Flow: From Product Listing and Purchase to Wholesaler Accreditation, QA Verification, Driver Transit, and Admin Audit.</w:t>
       </w:r>
     </w:p>
     <w:tbl>
@@ -229,7 +229,7 @@
           <w:color w:val="1E293B"/>
           <w:sz w:val="20"/>
         </w:rPr>
-        <w:t>AgriTrace is a decentralized digital supply chain transparency platform engineered to empower Australian family farms, independent regional growers, accredited commercial wholesalers, cold-chain logistics providers, and conscious consumers. In Australia's retail food sector, major supermarket duopolies capture gross margins exceeding 50% to 60%, leaving primary producers vulnerable while obscuring food provenance from shoppers.</w:t>
+        <w:t>AgriTrace is a decentralized digital supply chain transparency platform engineered to empower Australian family farms, regional growers, accredited commercial wholesalers, cold-chain logistics fleets, and conscious consumers. In Australia's retail food sector, major supermarket duopolies capture gross margins exceeding 50% to 60%, leaving primary producers vulnerable while obscuring food provenance from shoppers.</w:t>
       </w:r>
     </w:p>
     <w:p>
@@ -298,19 +298,6 @@
           <w:sz w:val="17"/>
         </w:rPr>
         <w:t>Figure: Figure 1.1: AgriTrace System Architecture &amp; Hierarchical Visual Sitemap</w:t>
-      </w:r>
-    </w:p>
-    <w:p>
-      <w:pPr>
-        <w:spacing w:before="0" w:after="120" w:line="276" w:lineRule="auto"/>
-      </w:pPr>
-      <w:r>
-        <w:rPr>
-          <w:rFonts w:ascii="Calibri" w:hAnsi="Calibri"/>
-          <w:color w:val="1E293B"/>
-          <w:sz w:val="20"/>
-        </w:rPr>
-        <w:t>The supply chain enforces a strict 7-stage sequential state machine. An order cannot bypass stages or be altered retroactively once committed to the Cloud Firestore database.</w:t>
       </w:r>
     </w:p>
     <w:p>
@@ -540,7 +527,7 @@
                 <w:color w:val="1E293B"/>
                 <w:sz w:val="18"/>
               </w:rPr>
-              <w:t>Order Placed</w:t>
+              <w:t>Order Placed / Pending</w:t>
             </w:r>
           </w:p>
         </w:tc>
@@ -1251,7 +1238,7 @@
           <w:color w:val="1B4D20"/>
           <w:sz w:val="32"/>
         </w:rPr>
-        <w:t>2. Public Portal, Registration &amp; Authentication (login.html)</w:t>
+        <w:t>2. Complete End-to-End Working Operational Flow</w:t>
       </w:r>
     </w:p>
     <w:p>
@@ -1264,7 +1251,7 @@
           <w:color w:val="1E293B"/>
           <w:sz w:val="20"/>
         </w:rPr>
-        <w:t>The public web application provides open access to the platform overview, educational transparency metrics, stakeholder registration, and secure authentication with automated role-based routing.</w:t>
+        <w:t>This section illustrates the full, connected working flow of an authentic transaction through every stage of the AgriTrace platform: from a farmer adding a fresh harvest batch, to a consumer purchasing it, the farmer confirming it, the administrator vetting the wholesaler, the wholesaler auditing the batch, the logistics driver executing physical transport, the customer tracking delivery, and the administrator auditing the final ledger.</w:t>
       </w:r>
     </w:p>
     <w:p>
@@ -1279,7 +1266,7 @@
           <w:color w:val="2E7D32"/>
           <w:sz w:val="26"/>
         </w:rPr>
-        <w:t>2.1 Public Landing Page (index.html)</w:t>
+        <w:t>Step 2.1: Public Entry &amp; 1-Click Authentication</w:t>
       </w:r>
     </w:p>
     <w:p>
@@ -1292,7 +1279,7 @@
           <w:color w:val="1E293B"/>
           <w:sz w:val="20"/>
         </w:rPr>
-        <w:t>Visitors can explore AgriTrace's core mission, interactive transparency widgets, Australian regional harvest stories, and direct navigation links to all platform documentation.</w:t>
+        <w:t>Users enter via index.html and sign in via login.html using the 1-Click Demo Login toolbar. All accounts are pre-seeded with authentic Australian regional identities and uniform password 'password123'.</w:t>
       </w:r>
     </w:p>
     <w:p>
@@ -1312,7 +1299,7 @@
               <a:graphicData uri="http://schemas.openxmlformats.org/drawingml/2006/picture">
                 <pic:pic>
                   <pic:nvPicPr>
-                    <pic:cNvPr id="0" name="portal_01_landing_page.png"/>
+                    <pic:cNvPr id="0" name="flow_01_landing_page.png"/>
                     <pic:cNvPicPr/>
                   </pic:nvPicPr>
                   <pic:blipFill>
@@ -1347,150 +1334,7 @@
           <w:color w:val="64748B"/>
           <w:sz w:val="17"/>
         </w:rPr>
-        <w:t>Figure: Figure 2.1: Public Landing Page featuring Australian Fair-Trade Mission &amp; Direct Portal Entry</w:t>
-      </w:r>
-    </w:p>
-    <w:p>
-      <w:pPr>
-        <w:keepNext/>
-        <w:spacing w:before="280" w:after="80"/>
-      </w:pPr>
-      <w:r>
-        <w:rPr>
-          <w:rFonts w:ascii="Calibri" w:hAnsi="Calibri"/>
-          <w:b/>
-          <w:color w:val="2E7D32"/>
-          <w:sz w:val="26"/>
-        </w:rPr>
-        <w:t>2.2 Stakeholder Account Registration (register.html)</w:t>
-      </w:r>
-    </w:p>
-    <w:p>
-      <w:pPr>
-        <w:spacing w:before="0" w:after="120" w:line="276" w:lineRule="auto"/>
-      </w:pPr>
-      <w:r>
-        <w:rPr>
-          <w:rFonts w:ascii="Calibri" w:hAnsi="Calibri"/>
-          <w:color w:val="1E293B"/>
-          <w:sz w:val="20"/>
-        </w:rPr>
-        <w:t>New stakeholders register via register.html. Depending on the selected role, the interface dynamically displays pertinent metadata fields required for verification:</w:t>
-      </w:r>
-    </w:p>
-    <w:p>
-      <w:pPr>
-        <w:pStyle w:val="ListBullet"/>
-        <w:spacing w:before="0" w:after="60" w:line="276" w:lineRule="auto"/>
-      </w:pPr>
-      <w:r>
-        <w:rPr>
-          <w:rFonts w:ascii="Calibri" w:hAnsi="Calibri"/>
-          <w:b/>
-          <w:color w:val="1E293B"/>
-          <w:sz w:val="20"/>
-        </w:rPr>
-        <w:t xml:space="preserve">• </w:t>
-      </w:r>
-      <w:r>
-        <w:rPr>
-          <w:rFonts w:ascii="Calibri" w:hAnsi="Calibri"/>
-          <w:color w:val="1E293B"/>
-          <w:sz w:val="20"/>
-        </w:rPr>
-        <w:t>Full Name &amp; Legal Business Entity Name</w:t>
-      </w:r>
-    </w:p>
-    <w:p>
-      <w:pPr>
-        <w:pStyle w:val="ListBullet"/>
-        <w:spacing w:before="0" w:after="60" w:line="276" w:lineRule="auto"/>
-      </w:pPr>
-      <w:r>
-        <w:rPr>
-          <w:rFonts w:ascii="Calibri" w:hAnsi="Calibri"/>
-          <w:b/>
-          <w:color w:val="1E293B"/>
-          <w:sz w:val="20"/>
-        </w:rPr>
-        <w:t xml:space="preserve">• </w:t>
-      </w:r>
-      <w:r>
-        <w:rPr>
-          <w:rFonts w:ascii="Calibri" w:hAnsi="Calibri"/>
-          <w:color w:val="1E293B"/>
-          <w:sz w:val="20"/>
-        </w:rPr>
-        <w:t>Registered Email Address &amp; Australian Mobile Phone (e.g., 0412 345 678)</w:t>
-      </w:r>
-    </w:p>
-    <w:p>
-      <w:pPr>
-        <w:pStyle w:val="ListBullet"/>
-        <w:spacing w:before="0" w:after="60" w:line="276" w:lineRule="auto"/>
-      </w:pPr>
-      <w:r>
-        <w:rPr>
-          <w:rFonts w:ascii="Calibri" w:hAnsi="Calibri"/>
-          <w:b/>
-          <w:color w:val="1E293B"/>
-          <w:sz w:val="20"/>
-        </w:rPr>
-        <w:t xml:space="preserve">• </w:t>
-      </w:r>
-      <w:r>
-        <w:rPr>
-          <w:rFonts w:ascii="Calibri" w:hAnsi="Calibri"/>
-          <w:color w:val="1E293B"/>
-          <w:sz w:val="20"/>
-        </w:rPr>
-        <w:t>Secure Account Password (minimum 6 alphanumeric characters)</w:t>
-      </w:r>
-    </w:p>
-    <w:p>
-      <w:pPr>
-        <w:pStyle w:val="ListBullet"/>
-        <w:spacing w:before="0" w:after="60" w:line="276" w:lineRule="auto"/>
-      </w:pPr>
-      <w:r>
-        <w:rPr>
-          <w:rFonts w:ascii="Calibri" w:hAnsi="Calibri"/>
-          <w:b/>
-          <w:color w:val="1E293B"/>
-          <w:sz w:val="20"/>
-        </w:rPr>
-        <w:t xml:space="preserve">• </w:t>
-      </w:r>
-      <w:r>
-        <w:rPr>
-          <w:rFonts w:ascii="Calibri" w:hAnsi="Calibri"/>
-          <w:color w:val="1E293B"/>
-          <w:sz w:val="20"/>
-        </w:rPr>
-        <w:t>Role Selection: Farmer, Wholesaler, Logistics Driver, or Consumer</w:t>
-      </w:r>
-    </w:p>
-    <w:p>
-      <w:pPr>
-        <w:pStyle w:val="ListBullet"/>
-        <w:spacing w:before="0" w:after="60" w:line="276" w:lineRule="auto"/>
-      </w:pPr>
-      <w:r>
-        <w:rPr>
-          <w:rFonts w:ascii="Calibri" w:hAnsi="Calibri"/>
-          <w:b/>
-          <w:color w:val="1E293B"/>
-          <w:sz w:val="20"/>
-        </w:rPr>
-        <w:t xml:space="preserve">• </w:t>
-      </w:r>
-      <w:r>
-        <w:rPr>
-          <w:rFonts w:ascii="Calibri" w:hAnsi="Calibri"/>
-          <w:color w:val="1E293B"/>
-          <w:sz w:val="20"/>
-        </w:rPr>
-        <w:t>Role-Specific Geographic Metadata (Farm Location for growers; Commercial Warehouse Location for wholesalers; Delivery Address for consumers)</w:t>
+        <w:t>Figure: Flow 1: Public Hero Landing Page featuring Australian Regional Produce Mission</w:t>
       </w:r>
     </w:p>
     <w:p>
@@ -1510,7 +1354,7 @@
               <a:graphicData uri="http://schemas.openxmlformats.org/drawingml/2006/picture">
                 <pic:pic>
                   <pic:nvPicPr>
-                    <pic:cNvPr id="0" name="portal_03_register_page.png"/>
+                    <pic:cNvPr id="0" name="flow_02_login_page.png"/>
                     <pic:cNvPicPr/>
                   </pic:nvPicPr>
                   <pic:blipFill>
@@ -1545,7 +1389,7 @@
           <w:color w:val="64748B"/>
           <w:sz w:val="17"/>
         </w:rPr>
-        <w:t>Figure: Figure 2.2: Stakeholder Registration Portal with Dynamic Role-Based Metadata Fields</w:t>
+        <w:t>Figure: Flow 2: Secure Authentication Portal with Integrated 1-Click Demo Bar</w:t>
       </w:r>
     </w:p>
     <w:p>
@@ -1560,7 +1404,7 @@
           <w:color w:val="2E7D32"/>
           <w:sz w:val="26"/>
         </w:rPr>
-        <w:t>2.3 Authentication &amp; 1-Click Demo Testing Toolbar (login.html)</w:t>
+        <w:t>Step 2.2: Farmer Publishes Fresh Harvest Batch</w:t>
       </w:r>
     </w:p>
     <w:p>
@@ -1573,63 +1417,1897 @@
           <w:color w:val="1E293B"/>
           <w:sz w:val="20"/>
         </w:rPr>
-        <w:t>To facilitate rapid User Acceptance Testing (UAT) and operational evaluation without manual credential setup, AgriTrace features an integrated 1-Click Demo Login bar directly on login.html. Clicking any demo button automatically injects seeded credentials and executes secure authentication.</w:t>
+        <w:t>Jack Miller (Yarra Valley Harvests VIC) logs into farmer/dashboard.html, opens farmer/products.html, clicks '+ Add Product', and lists a new batch: 'Barossa Valley Organic Shiraz Grapes' ($6.80 AUD/kg, 150 kg stock).</w:t>
       </w:r>
     </w:p>
-    <w:tbl>
-      <w:tblPr>
-        <w:tblW w:type="auto" w:w="0"/>
-        <w:jc w:val="center"/>
-        <w:tblLayout w:type="fixed"/>
-        <w:tblLook w:firstColumn="1" w:firstRow="1" w:lastColumn="0" w:lastRow="0" w:noHBand="0" w:noVBand="1" w:val="04A0"/>
-      </w:tblPr>
-      <w:tblGrid>
-        <w:gridCol w:w="9360"/>
-      </w:tblGrid>
-      <w:tr>
-        <w:tc>
-          <w:tcPr>
-            <w:tcW w:type="dxa" w:w="9360"/>
-            <w:shd w:fill="F0FDF4"/>
-            <w:tcMar>
-              <w:top w:w="140" w:type="dxa"/>
-              <w:bottom w:w="140" w:type="dxa"/>
-              <w:left w:w="200" w:type="dxa"/>
-              <w:right w:w="200" w:type="dxa"/>
-            </w:tcMar>
-          </w:tcPr>
-          <w:p>
-            <w:pPr>
-              <w:spacing w:before="0" w:after="40"/>
-            </w:pPr>
-            <w:r>
-              <w:rPr>
-                <w:rFonts w:ascii="Calibri" w:hAnsi="Calibri"/>
-                <w:b/>
-                <w:color w:val="1B4D20"/>
-                <w:sz w:val="19"/>
-              </w:rPr>
-              <w:t>■ QUICK ACCESS SECURITY KEY</w:t>
-              <w:br/>
-            </w:r>
-            <w:r>
-              <w:rPr>
-                <w:rFonts w:ascii="Calibri" w:hAnsi="Calibri"/>
-                <w:color w:val="1E293B"/>
-                <w:sz w:val="19"/>
-              </w:rPr>
-              <w:t>Uniform Demo Password: password123</w:t>
-              <w:br/>
-              <w:t>All pre-seeded Australian stakeholder accounts utilize the uniform password 'password123'. Clicking any demo toolbar button instantly logs into the selected role environment.</w:t>
-            </w:r>
-          </w:p>
-        </w:tc>
-      </w:tr>
-    </w:tbl>
     <w:p>
       <w:pPr>
-        <w:spacing w:after="120"/>
+        <w:spacing w:before="160" w:after="60"/>
+        <w:jc w:val="center"/>
       </w:pPr>
+      <w:r>
+        <w:drawing>
+          <wp:inline xmlns:a="http://schemas.openxmlformats.org/drawingml/2006/main" xmlns:pic="http://schemas.openxmlformats.org/drawingml/2006/picture">
+            <wp:extent cx="5486400" cy="3587262"/>
+            <wp:docPr id="5" name="Picture 5"/>
+            <wp:cNvGraphicFramePr>
+              <a:graphicFrameLocks noChangeAspect="1"/>
+            </wp:cNvGraphicFramePr>
+            <a:graphic>
+              <a:graphicData uri="http://schemas.openxmlformats.org/drawingml/2006/picture">
+                <pic:pic>
+                  <pic:nvPicPr>
+                    <pic:cNvPr id="0" name="flow_03_farmer_dashboard.png"/>
+                    <pic:cNvPicPr/>
+                  </pic:nvPicPr>
+                  <pic:blipFill>
+                    <a:blip r:embed="rId15"/>
+                    <a:stretch>
+                      <a:fillRect/>
+                    </a:stretch>
+                  </pic:blipFill>
+                  <pic:spPr>
+                    <a:xfrm>
+                      <a:off x="0" y="0"/>
+                      <a:ext cx="5486400" cy="3587262"/>
+                    </a:xfrm>
+                    <a:prstGeom prst="rect"/>
+                  </pic:spPr>
+                </pic:pic>
+              </a:graphicData>
+            </a:graphic>
+          </wp:inline>
+        </w:drawing>
+      </w:r>
+    </w:p>
+    <w:p>
+      <w:pPr>
+        <w:spacing w:before="0" w:after="240"/>
+        <w:jc w:val="center"/>
+      </w:pPr>
+      <w:r>
+        <w:rPr>
+          <w:rFonts w:ascii="Calibri" w:hAnsi="Calibri"/>
+          <w:i/>
+          <w:color w:val="64748B"/>
+          <w:sz w:val="17"/>
+        </w:rPr>
+        <w:t>Figure: Flow 3: Farmer Operations Command Center &amp; Revenue Telemetry</w:t>
+      </w:r>
+    </w:p>
+    <w:p>
+      <w:pPr>
+        <w:spacing w:before="160" w:after="60"/>
+        <w:jc w:val="center"/>
+      </w:pPr>
+      <w:r>
+        <w:drawing>
+          <wp:inline xmlns:a="http://schemas.openxmlformats.org/drawingml/2006/main" xmlns:pic="http://schemas.openxmlformats.org/drawingml/2006/picture">
+            <wp:extent cx="5486400" cy="3587262"/>
+            <wp:docPr id="6" name="Picture 6"/>
+            <wp:cNvGraphicFramePr>
+              <a:graphicFrameLocks noChangeAspect="1"/>
+            </wp:cNvGraphicFramePr>
+            <a:graphic>
+              <a:graphicData uri="http://schemas.openxmlformats.org/drawingml/2006/picture">
+                <pic:pic>
+                  <pic:nvPicPr>
+                    <pic:cNvPr id="0" name="flow_04_farmer_add_product_modal.png"/>
+                    <pic:cNvPicPr/>
+                  </pic:nvPicPr>
+                  <pic:blipFill>
+                    <a:blip r:embed="rId16"/>
+                    <a:stretch>
+                      <a:fillRect/>
+                    </a:stretch>
+                  </pic:blipFill>
+                  <pic:spPr>
+                    <a:xfrm>
+                      <a:off x="0" y="0"/>
+                      <a:ext cx="5486400" cy="3587262"/>
+                    </a:xfrm>
+                    <a:prstGeom prst="rect"/>
+                  </pic:spPr>
+                </pic:pic>
+              </a:graphicData>
+            </a:graphic>
+          </wp:inline>
+        </w:drawing>
+      </w:r>
+    </w:p>
+    <w:p>
+      <w:pPr>
+        <w:spacing w:before="0" w:after="240"/>
+        <w:jc w:val="center"/>
+      </w:pPr>
+      <w:r>
+        <w:rPr>
+          <w:rFonts w:ascii="Calibri" w:hAnsi="Calibri"/>
+          <w:i/>
+          <w:color w:val="64748B"/>
+          <w:sz w:val="17"/>
+        </w:rPr>
+        <w:t>Figure: Flow 4: Farmer Add Product Modal with Barossa Valley Grapes Specifications</w:t>
+      </w:r>
+    </w:p>
+    <w:p>
+      <w:pPr>
+        <w:spacing w:before="160" w:after="60"/>
+        <w:jc w:val="center"/>
+      </w:pPr>
+      <w:r>
+        <w:drawing>
+          <wp:inline xmlns:a="http://schemas.openxmlformats.org/drawingml/2006/main" xmlns:pic="http://schemas.openxmlformats.org/drawingml/2006/picture">
+            <wp:extent cx="5486400" cy="3587262"/>
+            <wp:docPr id="7" name="Picture 7"/>
+            <wp:cNvGraphicFramePr>
+              <a:graphicFrameLocks noChangeAspect="1"/>
+            </wp:cNvGraphicFramePr>
+            <a:graphic>
+              <a:graphicData uri="http://schemas.openxmlformats.org/drawingml/2006/picture">
+                <pic:pic>
+                  <pic:nvPicPr>
+                    <pic:cNvPr id="0" name="flow_05_farmer_product_saved.png"/>
+                    <pic:cNvPicPr/>
+                  </pic:nvPicPr>
+                  <pic:blipFill>
+                    <a:blip r:embed="rId17"/>
+                    <a:stretch>
+                      <a:fillRect/>
+                    </a:stretch>
+                  </pic:blipFill>
+                  <pic:spPr>
+                    <a:xfrm>
+                      <a:off x="0" y="0"/>
+                      <a:ext cx="5486400" cy="3587262"/>
+                    </a:xfrm>
+                    <a:prstGeom prst="rect"/>
+                  </pic:spPr>
+                </pic:pic>
+              </a:graphicData>
+            </a:graphic>
+          </wp:inline>
+        </w:drawing>
+      </w:r>
+    </w:p>
+    <w:p>
+      <w:pPr>
+        <w:spacing w:before="0" w:after="240"/>
+        <w:jc w:val="center"/>
+      </w:pPr>
+      <w:r>
+        <w:rPr>
+          <w:rFonts w:ascii="Calibri" w:hAnsi="Calibri"/>
+          <w:i/>
+          <w:color w:val="64748B"/>
+          <w:sz w:val="17"/>
+        </w:rPr>
+        <w:t>Figure: Flow 5: Newly Added Produce Published Live in Farmer Catalog</w:t>
+      </w:r>
+    </w:p>
+    <w:p>
+      <w:pPr>
+        <w:keepNext/>
+        <w:spacing w:before="280" w:after="80"/>
+      </w:pPr>
+      <w:r>
+        <w:rPr>
+          <w:rFonts w:ascii="Calibri" w:hAnsi="Calibri"/>
+          <w:b/>
+          <w:color w:val="2E7D32"/>
+          <w:sz w:val="26"/>
+        </w:rPr>
+        <w:t>Step 2.3: Consumer Discovers Produce &amp; Executes Fair-Trade Checkout</w:t>
+      </w:r>
+    </w:p>
+    <w:p>
+      <w:pPr>
+        <w:spacing w:before="0" w:after="120" w:line="276" w:lineRule="auto"/>
+      </w:pPr>
+      <w:r>
+        <w:rPr>
+          <w:rFonts w:ascii="Calibri" w:hAnsi="Calibri"/>
+          <w:color w:val="1E293B"/>
+          <w:sz w:val="20"/>
+        </w:rPr>
+        <w:t>Chloe Taylor (Customer, Melbourne VIC) logs into customer/products.html, spots the newly harvested Barossa Valley grapes with regional origin tag, adds 5 kg to cart, reviews itemized AUD pricing ($34.00 AUD) in customer/cart.html, and executes checkout.</w:t>
+      </w:r>
+    </w:p>
+    <w:p>
+      <w:pPr>
+        <w:spacing w:before="160" w:after="60"/>
+        <w:jc w:val="center"/>
+      </w:pPr>
+      <w:r>
+        <w:drawing>
+          <wp:inline xmlns:a="http://schemas.openxmlformats.org/drawingml/2006/main" xmlns:pic="http://schemas.openxmlformats.org/drawingml/2006/picture">
+            <wp:extent cx="5486400" cy="3587262"/>
+            <wp:docPr id="8" name="Picture 8"/>
+            <wp:cNvGraphicFramePr>
+              <a:graphicFrameLocks noChangeAspect="1"/>
+            </wp:cNvGraphicFramePr>
+            <a:graphic>
+              <a:graphicData uri="http://schemas.openxmlformats.org/drawingml/2006/picture">
+                <pic:pic>
+                  <pic:nvPicPr>
+                    <pic:cNvPr id="0" name="flow_06_customer_marketplace.png"/>
+                    <pic:cNvPicPr/>
+                  </pic:nvPicPr>
+                  <pic:blipFill>
+                    <a:blip r:embed="rId18"/>
+                    <a:stretch>
+                      <a:fillRect/>
+                    </a:stretch>
+                  </pic:blipFill>
+                  <pic:spPr>
+                    <a:xfrm>
+                      <a:off x="0" y="0"/>
+                      <a:ext cx="5486400" cy="3587262"/>
+                    </a:xfrm>
+                    <a:prstGeom prst="rect"/>
+                  </pic:spPr>
+                </pic:pic>
+              </a:graphicData>
+            </a:graphic>
+          </wp:inline>
+        </w:drawing>
+      </w:r>
+    </w:p>
+    <w:p>
+      <w:pPr>
+        <w:spacing w:before="0" w:after="240"/>
+        <w:jc w:val="center"/>
+      </w:pPr>
+      <w:r>
+        <w:rPr>
+          <w:rFonts w:ascii="Calibri" w:hAnsi="Calibri"/>
+          <w:i/>
+          <w:color w:val="64748B"/>
+          <w:sz w:val="17"/>
+        </w:rPr>
+        <w:t>Figure: Flow 6: Fresh Produce Marketplace Displaying Newly Published Barossa Valley Grapes</w:t>
+      </w:r>
+    </w:p>
+    <w:p>
+      <w:pPr>
+        <w:spacing w:before="160" w:after="60"/>
+        <w:jc w:val="center"/>
+      </w:pPr>
+      <w:r>
+        <w:drawing>
+          <wp:inline xmlns:a="http://schemas.openxmlformats.org/drawingml/2006/main" xmlns:pic="http://schemas.openxmlformats.org/drawingml/2006/picture">
+            <wp:extent cx="5486400" cy="3587262"/>
+            <wp:docPr id="9" name="Picture 9"/>
+            <wp:cNvGraphicFramePr>
+              <a:graphicFrameLocks noChangeAspect="1"/>
+            </wp:cNvGraphicFramePr>
+            <a:graphic>
+              <a:graphicData uri="http://schemas.openxmlformats.org/drawingml/2006/picture">
+                <pic:pic>
+                  <pic:nvPicPr>
+                    <pic:cNvPr id="0" name="flow_07_customer_cart.png"/>
+                    <pic:cNvPicPr/>
+                  </pic:nvPicPr>
+                  <pic:blipFill>
+                    <a:blip r:embed="rId19"/>
+                    <a:stretch>
+                      <a:fillRect/>
+                    </a:stretch>
+                  </pic:blipFill>
+                  <pic:spPr>
+                    <a:xfrm>
+                      <a:off x="0" y="0"/>
+                      <a:ext cx="5486400" cy="3587262"/>
+                    </a:xfrm>
+                    <a:prstGeom prst="rect"/>
+                  </pic:spPr>
+                </pic:pic>
+              </a:graphicData>
+            </a:graphic>
+          </wp:inline>
+        </w:drawing>
+      </w:r>
+    </w:p>
+    <w:p>
+      <w:pPr>
+        <w:spacing w:before="0" w:after="240"/>
+        <w:jc w:val="center"/>
+      </w:pPr>
+      <w:r>
+        <w:rPr>
+          <w:rFonts w:ascii="Calibri" w:hAnsi="Calibri"/>
+          <w:i/>
+          <w:color w:val="64748B"/>
+          <w:sz w:val="17"/>
+        </w:rPr>
+        <w:t>Figure: Flow 7: Shopping Cart with Itemized AUD Pricing and Delivery Destination</w:t>
+      </w:r>
+    </w:p>
+    <w:p>
+      <w:pPr>
+        <w:spacing w:before="160" w:after="60"/>
+        <w:jc w:val="center"/>
+      </w:pPr>
+      <w:r>
+        <w:drawing>
+          <wp:inline xmlns:a="http://schemas.openxmlformats.org/drawingml/2006/main" xmlns:pic="http://schemas.openxmlformats.org/drawingml/2006/picture">
+            <wp:extent cx="5486400" cy="3587262"/>
+            <wp:docPr id="10" name="Picture 10"/>
+            <wp:cNvGraphicFramePr>
+              <a:graphicFrameLocks noChangeAspect="1"/>
+            </wp:cNvGraphicFramePr>
+            <a:graphic>
+              <a:graphicData uri="http://schemas.openxmlformats.org/drawingml/2006/picture">
+                <pic:pic>
+                  <pic:nvPicPr>
+                    <pic:cNvPr id="0" name="flow_07_customer_cart.png"/>
+                    <pic:cNvPicPr/>
+                  </pic:nvPicPr>
+                  <pic:blipFill>
+                    <a:blip r:embed="rId19"/>
+                    <a:stretch>
+                      <a:fillRect/>
+                    </a:stretch>
+                  </pic:blipFill>
+                  <pic:spPr>
+                    <a:xfrm>
+                      <a:off x="0" y="0"/>
+                      <a:ext cx="5486400" cy="3587262"/>
+                    </a:xfrm>
+                    <a:prstGeom prst="rect"/>
+                  </pic:spPr>
+                </pic:pic>
+              </a:graphicData>
+            </a:graphic>
+          </wp:inline>
+        </w:drawing>
+      </w:r>
+    </w:p>
+    <w:p>
+      <w:pPr>
+        <w:spacing w:before="0" w:after="240"/>
+        <w:jc w:val="center"/>
+      </w:pPr>
+      <w:r>
+        <w:rPr>
+          <w:rFonts w:ascii="Calibri" w:hAnsi="Calibri"/>
+          <w:i/>
+          <w:color w:val="64748B"/>
+          <w:sz w:val="17"/>
+        </w:rPr>
+        <w:t>Figure: Flow 8: Fair-Trade Order Checkout Completed with Atomic Stock Reservation</w:t>
+      </w:r>
+    </w:p>
+    <w:p>
+      <w:pPr>
+        <w:spacing w:before="160" w:after="60"/>
+        <w:jc w:val="center"/>
+      </w:pPr>
+      <w:r>
+        <w:drawing>
+          <wp:inline xmlns:a="http://schemas.openxmlformats.org/drawingml/2006/main" xmlns:pic="http://schemas.openxmlformats.org/drawingml/2006/picture">
+            <wp:extent cx="5486400" cy="3587262"/>
+            <wp:docPr id="11" name="Picture 11"/>
+            <wp:cNvGraphicFramePr>
+              <a:graphicFrameLocks noChangeAspect="1"/>
+            </wp:cNvGraphicFramePr>
+            <a:graphic>
+              <a:graphicData uri="http://schemas.openxmlformats.org/drawingml/2006/picture">
+                <pic:pic>
+                  <pic:nvPicPr>
+                    <pic:cNvPr id="0" name="flow_09_customer_order_tracking_step1.png"/>
+                    <pic:cNvPicPr/>
+                  </pic:nvPicPr>
+                  <pic:blipFill>
+                    <a:blip r:embed="rId20"/>
+                    <a:stretch>
+                      <a:fillRect/>
+                    </a:stretch>
+                  </pic:blipFill>
+                  <pic:spPr>
+                    <a:xfrm>
+                      <a:off x="0" y="0"/>
+                      <a:ext cx="5486400" cy="3587262"/>
+                    </a:xfrm>
+                    <a:prstGeom prst="rect"/>
+                  </pic:spPr>
+                </pic:pic>
+              </a:graphicData>
+            </a:graphic>
+          </wp:inline>
+        </w:drawing>
+      </w:r>
+    </w:p>
+    <w:p>
+      <w:pPr>
+        <w:spacing w:before="0" w:after="240"/>
+        <w:jc w:val="center"/>
+      </w:pPr>
+      <w:r>
+        <w:rPr>
+          <w:rFonts w:ascii="Calibri" w:hAnsi="Calibri"/>
+          <w:i/>
+          <w:color w:val="64748B"/>
+          <w:sz w:val="17"/>
+        </w:rPr>
+        <w:t>Figure: Flow 9: Customer 7-Stage Live Order Tracker (Stage 1: Order Placed)</w:t>
+      </w:r>
+    </w:p>
+    <w:p>
+      <w:pPr>
+        <w:keepNext/>
+        <w:spacing w:before="280" w:after="80"/>
+      </w:pPr>
+      <w:r>
+        <w:rPr>
+          <w:rFonts w:ascii="Calibri" w:hAnsi="Calibri"/>
+          <w:b/>
+          <w:color w:val="2E7D32"/>
+          <w:sz w:val="26"/>
+        </w:rPr>
+        <w:t>Step 2.4: Farmer Confirms Order Preparation</w:t>
+      </w:r>
+    </w:p>
+    <w:p>
+      <w:pPr>
+        <w:spacing w:before="0" w:after="120" w:line="276" w:lineRule="auto"/>
+      </w:pPr>
+      <w:r>
+        <w:rPr>
+          <w:rFonts w:ascii="Calibri" w:hAnsi="Calibri"/>
+          <w:color w:val="1E293B"/>
+          <w:sz w:val="20"/>
+        </w:rPr>
+        <w:t>Jack Miller opens farmer/orders.html, sees Chloe's new inbound order, packs the 5 kg harvest batch, and clicks 'Confirm Order'. The order status advances to 'Farmer Confirmed'.</w:t>
+      </w:r>
+    </w:p>
+    <w:p>
+      <w:pPr>
+        <w:spacing w:before="160" w:after="60"/>
+        <w:jc w:val="center"/>
+      </w:pPr>
+      <w:r>
+        <w:drawing>
+          <wp:inline xmlns:a="http://schemas.openxmlformats.org/drawingml/2006/main" xmlns:pic="http://schemas.openxmlformats.org/drawingml/2006/picture">
+            <wp:extent cx="5486400" cy="3587262"/>
+            <wp:docPr id="12" name="Picture 12"/>
+            <wp:cNvGraphicFramePr>
+              <a:graphicFrameLocks noChangeAspect="1"/>
+            </wp:cNvGraphicFramePr>
+            <a:graphic>
+              <a:graphicData uri="http://schemas.openxmlformats.org/drawingml/2006/picture">
+                <pic:pic>
+                  <pic:nvPicPr>
+                    <pic:cNvPr id="0" name="flow_10_farmer_inbound_order.png"/>
+                    <pic:cNvPicPr/>
+                  </pic:nvPicPr>
+                  <pic:blipFill>
+                    <a:blip r:embed="rId21"/>
+                    <a:stretch>
+                      <a:fillRect/>
+                    </a:stretch>
+                  </pic:blipFill>
+                  <pic:spPr>
+                    <a:xfrm>
+                      <a:off x="0" y="0"/>
+                      <a:ext cx="5486400" cy="3587262"/>
+                    </a:xfrm>
+                    <a:prstGeom prst="rect"/>
+                  </pic:spPr>
+                </pic:pic>
+              </a:graphicData>
+            </a:graphic>
+          </wp:inline>
+        </w:drawing>
+      </w:r>
+    </w:p>
+    <w:p>
+      <w:pPr>
+        <w:spacing w:before="0" w:after="240"/>
+        <w:jc w:val="center"/>
+      </w:pPr>
+      <w:r>
+        <w:rPr>
+          <w:rFonts w:ascii="Calibri" w:hAnsi="Calibri"/>
+          <w:i/>
+          <w:color w:val="64748B"/>
+          <w:sz w:val="17"/>
+        </w:rPr>
+        <w:t>Figure: Flow 10: Inbound Order Queue Displaying Chloe Taylor's New Order</w:t>
+      </w:r>
+    </w:p>
+    <w:p>
+      <w:pPr>
+        <w:spacing w:before="160" w:after="60"/>
+        <w:jc w:val="center"/>
+      </w:pPr>
+      <w:r>
+        <w:drawing>
+          <wp:inline xmlns:a="http://schemas.openxmlformats.org/drawingml/2006/main" xmlns:pic="http://schemas.openxmlformats.org/drawingml/2006/picture">
+            <wp:extent cx="5486400" cy="3587262"/>
+            <wp:docPr id="13" name="Picture 13"/>
+            <wp:cNvGraphicFramePr>
+              <a:graphicFrameLocks noChangeAspect="1"/>
+            </wp:cNvGraphicFramePr>
+            <a:graphic>
+              <a:graphicData uri="http://schemas.openxmlformats.org/drawingml/2006/picture">
+                <pic:pic>
+                  <pic:nvPicPr>
+                    <pic:cNvPr id="0" name="flow_11_farmer_order_confirmed.png"/>
+                    <pic:cNvPicPr/>
+                  </pic:nvPicPr>
+                  <pic:blipFill>
+                    <a:blip r:embed="rId22"/>
+                    <a:stretch>
+                      <a:fillRect/>
+                    </a:stretch>
+                  </pic:blipFill>
+                  <pic:spPr>
+                    <a:xfrm>
+                      <a:off x="0" y="0"/>
+                      <a:ext cx="5486400" cy="3587262"/>
+                    </a:xfrm>
+                    <a:prstGeom prst="rect"/>
+                  </pic:spPr>
+                </pic:pic>
+              </a:graphicData>
+            </a:graphic>
+          </wp:inline>
+        </w:drawing>
+      </w:r>
+    </w:p>
+    <w:p>
+      <w:pPr>
+        <w:spacing w:before="0" w:after="240"/>
+        <w:jc w:val="center"/>
+      </w:pPr>
+      <w:r>
+        <w:rPr>
+          <w:rFonts w:ascii="Calibri" w:hAnsi="Calibri"/>
+          <w:i/>
+          <w:color w:val="64748B"/>
+          <w:sz w:val="17"/>
+        </w:rPr>
+        <w:t>Figure: Flow 11: Order Confirmed by Farmer and Routed to Wholesaler QA Queue</w:t>
+      </w:r>
+    </w:p>
+    <w:p>
+      <w:pPr>
+        <w:keepNext/>
+        <w:spacing w:before="280" w:after="80"/>
+      </w:pPr>
+      <w:r>
+        <w:rPr>
+          <w:rFonts w:ascii="Calibri" w:hAnsi="Calibri"/>
+          <w:b/>
+          <w:color w:val="2E7D32"/>
+          <w:sz w:val="26"/>
+        </w:rPr>
+        <w:t>Step 2.5: Administrator Wholesaler Accreditation Governance</w:t>
+      </w:r>
+    </w:p>
+    <w:p>
+      <w:pPr>
+        <w:spacing w:before="0" w:after="120" w:line="276" w:lineRule="auto"/>
+      </w:pPr>
+      <w:r>
+        <w:rPr>
+          <w:rFonts w:ascii="Calibri" w:hAnsi="Calibri"/>
+          <w:color w:val="1E293B"/>
+          <w:sz w:val="20"/>
+        </w:rPr>
+        <w:t>Before unvetted wholesalers can certify farm shipments, they must undergo regulatory accreditation. When Matilda Evans (Melbourne Wholesale Hub) registers, her account is locked in 'Pending Review' status.</w:t>
+      </w:r>
+    </w:p>
+    <w:p>
+      <w:pPr>
+        <w:spacing w:before="160" w:after="60"/>
+        <w:jc w:val="center"/>
+      </w:pPr>
+      <w:r>
+        <w:drawing>
+          <wp:inline xmlns:a="http://schemas.openxmlformats.org/drawingml/2006/main" xmlns:pic="http://schemas.openxmlformats.org/drawingml/2006/picture">
+            <wp:extent cx="5486400" cy="3587262"/>
+            <wp:docPr id="14" name="Picture 14"/>
+            <wp:cNvGraphicFramePr>
+              <a:graphicFrameLocks noChangeAspect="1"/>
+            </wp:cNvGraphicFramePr>
+            <a:graphic>
+              <a:graphicData uri="http://schemas.openxmlformats.org/drawingml/2006/picture">
+                <pic:pic>
+                  <pic:nvPicPr>
+                    <pic:cNvPr id="0" name="flow_12_admin_approvals_pending.png"/>
+                    <pic:cNvPicPr/>
+                  </pic:nvPicPr>
+                  <pic:blipFill>
+                    <a:blip r:embed="rId23"/>
+                    <a:stretch>
+                      <a:fillRect/>
+                    </a:stretch>
+                  </pic:blipFill>
+                  <pic:spPr>
+                    <a:xfrm>
+                      <a:off x="0" y="0"/>
+                      <a:ext cx="5486400" cy="3587262"/>
+                    </a:xfrm>
+                    <a:prstGeom prst="rect"/>
+                  </pic:spPr>
+                </pic:pic>
+              </a:graphicData>
+            </a:graphic>
+          </wp:inline>
+        </w:drawing>
+      </w:r>
+    </w:p>
+    <w:p>
+      <w:pPr>
+        <w:spacing w:before="0" w:after="240"/>
+        <w:jc w:val="center"/>
+      </w:pPr>
+      <w:r>
+        <w:rPr>
+          <w:rFonts w:ascii="Calibri" w:hAnsi="Calibri"/>
+          <w:i/>
+          <w:color w:val="64748B"/>
+          <w:sz w:val="17"/>
+        </w:rPr>
+        <w:t>Figure: Flow 12: Admin Approvals Hub Showing Matilda Evans Awaiting Compliance Approval</w:t>
+      </w:r>
+    </w:p>
+    <w:p>
+      <w:pPr>
+        <w:spacing w:before="160" w:after="60"/>
+        <w:jc w:val="center"/>
+      </w:pPr>
+      <w:r>
+        <w:drawing>
+          <wp:inline xmlns:a="http://schemas.openxmlformats.org/drawingml/2006/main" xmlns:pic="http://schemas.openxmlformats.org/drawingml/2006/picture">
+            <wp:extent cx="5486400" cy="3587262"/>
+            <wp:docPr id="15" name="Picture 15"/>
+            <wp:cNvGraphicFramePr>
+              <a:graphicFrameLocks noChangeAspect="1"/>
+            </wp:cNvGraphicFramePr>
+            <a:graphic>
+              <a:graphicData uri="http://schemas.openxmlformats.org/drawingml/2006/picture">
+                <pic:pic>
+                  <pic:nvPicPr>
+                    <pic:cNvPr id="0" name="flow_13_wholesaler_pending_warning.png"/>
+                    <pic:cNvPicPr/>
+                  </pic:nvPicPr>
+                  <pic:blipFill>
+                    <a:blip r:embed="rId24"/>
+                    <a:stretch>
+                      <a:fillRect/>
+                    </a:stretch>
+                  </pic:blipFill>
+                  <pic:spPr>
+                    <a:xfrm>
+                      <a:off x="0" y="0"/>
+                      <a:ext cx="5486400" cy="3587262"/>
+                    </a:xfrm>
+                    <a:prstGeom prst="rect"/>
+                  </pic:spPr>
+                </pic:pic>
+              </a:graphicData>
+            </a:graphic>
+          </wp:inline>
+        </w:drawing>
+      </w:r>
+    </w:p>
+    <w:p>
+      <w:pPr>
+        <w:spacing w:before="0" w:after="240"/>
+        <w:jc w:val="center"/>
+      </w:pPr>
+      <w:r>
+        <w:rPr>
+          <w:rFonts w:ascii="Calibri" w:hAnsi="Calibri"/>
+          <w:i/>
+          <w:color w:val="64748B"/>
+          <w:sz w:val="17"/>
+        </w:rPr>
+        <w:t>Figure: Flow 13: Unaccredited Wholesaler Dashboard Displaying Regulatory Amber Warning Banner</w:t>
+      </w:r>
+    </w:p>
+    <w:p>
+      <w:pPr>
+        <w:spacing w:before="160" w:after="60"/>
+        <w:jc w:val="center"/>
+      </w:pPr>
+      <w:r>
+        <w:drawing>
+          <wp:inline xmlns:a="http://schemas.openxmlformats.org/drawingml/2006/main" xmlns:pic="http://schemas.openxmlformats.org/drawingml/2006/picture">
+            <wp:extent cx="5486400" cy="3587262"/>
+            <wp:docPr id="16" name="Picture 16"/>
+            <wp:cNvGraphicFramePr>
+              <a:graphicFrameLocks noChangeAspect="1"/>
+            </wp:cNvGraphicFramePr>
+            <a:graphic>
+              <a:graphicData uri="http://schemas.openxmlformats.org/drawingml/2006/picture">
+                <pic:pic>
+                  <pic:nvPicPr>
+                    <pic:cNvPr id="0" name="flow_14_wholesaler_pending_locked.png"/>
+                    <pic:cNvPicPr/>
+                  </pic:nvPicPr>
+                  <pic:blipFill>
+                    <a:blip r:embed="rId25"/>
+                    <a:stretch>
+                      <a:fillRect/>
+                    </a:stretch>
+                  </pic:blipFill>
+                  <pic:spPr>
+                    <a:xfrm>
+                      <a:off x="0" y="0"/>
+                      <a:ext cx="5486400" cy="3587262"/>
+                    </a:xfrm>
+                    <a:prstGeom prst="rect"/>
+                  </pic:spPr>
+                </pic:pic>
+              </a:graphicData>
+            </a:graphic>
+          </wp:inline>
+        </w:drawing>
+      </w:r>
+    </w:p>
+    <w:p>
+      <w:pPr>
+        <w:spacing w:before="0" w:after="240"/>
+        <w:jc w:val="center"/>
+      </w:pPr>
+      <w:r>
+        <w:rPr>
+          <w:rFonts w:ascii="Calibri" w:hAnsi="Calibri"/>
+          <w:i/>
+          <w:color w:val="64748B"/>
+          <w:sz w:val="17"/>
+        </w:rPr>
+        <w:t>Figure: Flow 14: Wholesaler QA Queue with Stock Verification Controls Locked</w:t>
+      </w:r>
+    </w:p>
+    <w:p>
+      <w:pPr>
+        <w:spacing w:before="160" w:after="60"/>
+        <w:jc w:val="center"/>
+      </w:pPr>
+      <w:r>
+        <w:drawing>
+          <wp:inline xmlns:a="http://schemas.openxmlformats.org/drawingml/2006/main" xmlns:pic="http://schemas.openxmlformats.org/drawingml/2006/picture">
+            <wp:extent cx="5486400" cy="3587262"/>
+            <wp:docPr id="17" name="Picture 17"/>
+            <wp:cNvGraphicFramePr>
+              <a:graphicFrameLocks noChangeAspect="1"/>
+            </wp:cNvGraphicFramePr>
+            <a:graphic>
+              <a:graphicData uri="http://schemas.openxmlformats.org/drawingml/2006/picture">
+                <pic:pic>
+                  <pic:nvPicPr>
+                    <pic:cNvPr id="0" name="flow_15_admin_wholesaler_approved.png"/>
+                    <pic:cNvPicPr/>
+                  </pic:nvPicPr>
+                  <pic:blipFill>
+                    <a:blip r:embed="rId26"/>
+                    <a:stretch>
+                      <a:fillRect/>
+                    </a:stretch>
+                  </pic:blipFill>
+                  <pic:spPr>
+                    <a:xfrm>
+                      <a:off x="0" y="0"/>
+                      <a:ext cx="5486400" cy="3587262"/>
+                    </a:xfrm>
+                    <a:prstGeom prst="rect"/>
+                  </pic:spPr>
+                </pic:pic>
+              </a:graphicData>
+            </a:graphic>
+          </wp:inline>
+        </w:drawing>
+      </w:r>
+    </w:p>
+    <w:p>
+      <w:pPr>
+        <w:spacing w:before="0" w:after="240"/>
+        <w:jc w:val="center"/>
+      </w:pPr>
+      <w:r>
+        <w:rPr>
+          <w:rFonts w:ascii="Calibri" w:hAnsi="Calibri"/>
+          <w:i/>
+          <w:color w:val="64748B"/>
+          <w:sz w:val="17"/>
+        </w:rPr>
+        <w:t>Figure: Flow 15: Admin Approves Wholesaler — Account Transitioned to Accredited Active Status</w:t>
+      </w:r>
+    </w:p>
+    <w:p>
+      <w:pPr>
+        <w:spacing w:before="160" w:after="60"/>
+        <w:jc w:val="center"/>
+      </w:pPr>
+      <w:r>
+        <w:drawing>
+          <wp:inline xmlns:a="http://schemas.openxmlformats.org/drawingml/2006/main" xmlns:pic="http://schemas.openxmlformats.org/drawingml/2006/picture">
+            <wp:extent cx="5486400" cy="3587262"/>
+            <wp:docPr id="18" name="Picture 18"/>
+            <wp:cNvGraphicFramePr>
+              <a:graphicFrameLocks noChangeAspect="1"/>
+            </wp:cNvGraphicFramePr>
+            <a:graphic>
+              <a:graphicData uri="http://schemas.openxmlformats.org/drawingml/2006/picture">
+                <pic:pic>
+                  <pic:nvPicPr>
+                    <pic:cNvPr id="0" name="flow_15_admin_wholesaler_approved.png"/>
+                    <pic:cNvPicPr/>
+                  </pic:nvPicPr>
+                  <pic:blipFill>
+                    <a:blip r:embed="rId26"/>
+                    <a:stretch>
+                      <a:fillRect/>
+                    </a:stretch>
+                  </pic:blipFill>
+                  <pic:spPr>
+                    <a:xfrm>
+                      <a:off x="0" y="0"/>
+                      <a:ext cx="5486400" cy="3587262"/>
+                    </a:xfrm>
+                    <a:prstGeom prst="rect"/>
+                  </pic:spPr>
+                </pic:pic>
+              </a:graphicData>
+            </a:graphic>
+          </wp:inline>
+        </w:drawing>
+      </w:r>
+    </w:p>
+    <w:p>
+      <w:pPr>
+        <w:spacing w:before="0" w:after="240"/>
+        <w:jc w:val="center"/>
+      </w:pPr>
+      <w:r>
+        <w:rPr>
+          <w:rFonts w:ascii="Calibri" w:hAnsi="Calibri"/>
+          <w:i/>
+          <w:color w:val="64748B"/>
+          <w:sz w:val="17"/>
+        </w:rPr>
+        <w:t>Figure: Flow 16: Admin Regulatory Enforcement — One-Click Revocation and Rejection Controls</w:t>
+      </w:r>
+    </w:p>
+    <w:p>
+      <w:pPr>
+        <w:keepNext/>
+        <w:spacing w:before="280" w:after="80"/>
+      </w:pPr>
+      <w:r>
+        <w:rPr>
+          <w:rFonts w:ascii="Calibri" w:hAnsi="Calibri"/>
+          <w:b/>
+          <w:color w:val="2E7D32"/>
+          <w:sz w:val="26"/>
+        </w:rPr>
+        <w:t>Step 2.6: Accredited Wholesaler Conducts Quality Audit</w:t>
+      </w:r>
+    </w:p>
+    <w:p>
+      <w:pPr>
+        <w:spacing w:before="0" w:after="120" w:line="276" w:lineRule="auto"/>
+      </w:pPr>
+      <w:r>
+        <w:rPr>
+          <w:rFonts w:ascii="Calibri" w:hAnsi="Calibri"/>
+          <w:color w:val="1E293B"/>
+          <w:sz w:val="20"/>
+        </w:rPr>
+        <w:t>Liam Wilson (Sydney Central Produce Markets Pty Ltd), an accredited wholesaler, opens wholesaler/orders.html. He audits crop freshness, temperature logs, and packaging tolerances before clicking 'Verify Stock'. The order transitions to 'Wholesaler Verified'.</w:t>
+      </w:r>
+    </w:p>
+    <w:p>
+      <w:pPr>
+        <w:spacing w:before="160" w:after="60"/>
+        <w:jc w:val="center"/>
+      </w:pPr>
+      <w:r>
+        <w:drawing>
+          <wp:inline xmlns:a="http://schemas.openxmlformats.org/drawingml/2006/main" xmlns:pic="http://schemas.openxmlformats.org/drawingml/2006/picture">
+            <wp:extent cx="5486400" cy="3587262"/>
+            <wp:docPr id="19" name="Picture 19"/>
+            <wp:cNvGraphicFramePr>
+              <a:graphicFrameLocks noChangeAspect="1"/>
+            </wp:cNvGraphicFramePr>
+            <a:graphic>
+              <a:graphicData uri="http://schemas.openxmlformats.org/drawingml/2006/picture">
+                <pic:pic>
+                  <pic:nvPicPr>
+                    <pic:cNvPr id="0" name="flow_17_wholesaler_approved_dashboard.png"/>
+                    <pic:cNvPicPr/>
+                  </pic:nvPicPr>
+                  <pic:blipFill>
+                    <a:blip r:embed="rId27"/>
+                    <a:stretch>
+                      <a:fillRect/>
+                    </a:stretch>
+                  </pic:blipFill>
+                  <pic:spPr>
+                    <a:xfrm>
+                      <a:off x="0" y="0"/>
+                      <a:ext cx="5486400" cy="3587262"/>
+                    </a:xfrm>
+                    <a:prstGeom prst="rect"/>
+                  </pic:spPr>
+                </pic:pic>
+              </a:graphicData>
+            </a:graphic>
+          </wp:inline>
+        </w:drawing>
+      </w:r>
+    </w:p>
+    <w:p>
+      <w:pPr>
+        <w:spacing w:before="0" w:after="240"/>
+        <w:jc w:val="center"/>
+      </w:pPr>
+      <w:r>
+        <w:rPr>
+          <w:rFonts w:ascii="Calibri" w:hAnsi="Calibri"/>
+          <w:i/>
+          <w:color w:val="64748B"/>
+          <w:sz w:val="17"/>
+        </w:rPr>
+        <w:t>Figure: Flow 17: Accredited Wholesaler Dashboard with Certified Regulatory Status</w:t>
+      </w:r>
+    </w:p>
+    <w:p>
+      <w:pPr>
+        <w:spacing w:before="160" w:after="60"/>
+        <w:jc w:val="center"/>
+      </w:pPr>
+      <w:r>
+        <w:drawing>
+          <wp:inline xmlns:a="http://schemas.openxmlformats.org/drawingml/2006/main" xmlns:pic="http://schemas.openxmlformats.org/drawingml/2006/picture">
+            <wp:extent cx="5486400" cy="3587262"/>
+            <wp:docPr id="20" name="Picture 20"/>
+            <wp:cNvGraphicFramePr>
+              <a:graphicFrameLocks noChangeAspect="1"/>
+            </wp:cNvGraphicFramePr>
+            <a:graphic>
+              <a:graphicData uri="http://schemas.openxmlformats.org/drawingml/2006/picture">
+                <pic:pic>
+                  <pic:nvPicPr>
+                    <pic:cNvPr id="0" name="flow_18_wholesaler_audit_queue.png"/>
+                    <pic:cNvPicPr/>
+                  </pic:nvPicPr>
+                  <pic:blipFill>
+                    <a:blip r:embed="rId28"/>
+                    <a:stretch>
+                      <a:fillRect/>
+                    </a:stretch>
+                  </pic:blipFill>
+                  <pic:spPr>
+                    <a:xfrm>
+                      <a:off x="0" y="0"/>
+                      <a:ext cx="5486400" cy="3587262"/>
+                    </a:xfrm>
+                    <a:prstGeom prst="rect"/>
+                  </pic:spPr>
+                </pic:pic>
+              </a:graphicData>
+            </a:graphic>
+          </wp:inline>
+        </w:drawing>
+      </w:r>
+    </w:p>
+    <w:p>
+      <w:pPr>
+        <w:spacing w:before="0" w:after="240"/>
+        <w:jc w:val="center"/>
+      </w:pPr>
+      <w:r>
+        <w:rPr>
+          <w:rFonts w:ascii="Calibri" w:hAnsi="Calibri"/>
+          <w:i/>
+          <w:color w:val="64748B"/>
+          <w:sz w:val="17"/>
+        </w:rPr>
+        <w:t>Figure: Flow 18: Quality Assurance Queue with Active 'Verify Stock' Controls</w:t>
+      </w:r>
+    </w:p>
+    <w:p>
+      <w:pPr>
+        <w:spacing w:before="160" w:after="60"/>
+        <w:jc w:val="center"/>
+      </w:pPr>
+      <w:r>
+        <w:drawing>
+          <wp:inline xmlns:a="http://schemas.openxmlformats.org/drawingml/2006/main" xmlns:pic="http://schemas.openxmlformats.org/drawingml/2006/picture">
+            <wp:extent cx="5486400" cy="3587262"/>
+            <wp:docPr id="21" name="Picture 21"/>
+            <wp:cNvGraphicFramePr>
+              <a:graphicFrameLocks noChangeAspect="1"/>
+            </wp:cNvGraphicFramePr>
+            <a:graphic>
+              <a:graphicData uri="http://schemas.openxmlformats.org/drawingml/2006/picture">
+                <pic:pic>
+                  <pic:nvPicPr>
+                    <pic:cNvPr id="0" name="flow_19_wholesaler_stock_verified.png"/>
+                    <pic:cNvPicPr/>
+                  </pic:nvPicPr>
+                  <pic:blipFill>
+                    <a:blip r:embed="rId29"/>
+                    <a:stretch>
+                      <a:fillRect/>
+                    </a:stretch>
+                  </pic:blipFill>
+                  <pic:spPr>
+                    <a:xfrm>
+                      <a:off x="0" y="0"/>
+                      <a:ext cx="5486400" cy="3587262"/>
+                    </a:xfrm>
+                    <a:prstGeom prst="rect"/>
+                  </pic:spPr>
+                </pic:pic>
+              </a:graphicData>
+            </a:graphic>
+          </wp:inline>
+        </w:drawing>
+      </w:r>
+    </w:p>
+    <w:p>
+      <w:pPr>
+        <w:spacing w:before="0" w:after="240"/>
+        <w:jc w:val="center"/>
+      </w:pPr>
+      <w:r>
+        <w:rPr>
+          <w:rFonts w:ascii="Calibri" w:hAnsi="Calibri"/>
+          <w:i/>
+          <w:color w:val="64748B"/>
+          <w:sz w:val="17"/>
+        </w:rPr>
+        <w:t>Figure: Flow 19: Batch Certified &amp; Wholesaler Verified — Dispatched to Logistics Fleet</w:t>
+      </w:r>
+    </w:p>
+    <w:p>
+      <w:pPr>
+        <w:keepNext/>
+        <w:spacing w:before="280" w:after="80"/>
+      </w:pPr>
+      <w:r>
+        <w:rPr>
+          <w:rFonts w:ascii="Calibri" w:hAnsi="Calibri"/>
+          <w:b/>
+          <w:color w:val="2E7D32"/>
+          <w:sz w:val="26"/>
+        </w:rPr>
+        <w:t>Step 2.7: Logistics Driver Executes Transit Milestones</w:t>
+      </w:r>
+    </w:p>
+    <w:p>
+      <w:pPr>
+        <w:spacing w:before="0" w:after="120" w:line="276" w:lineRule="auto"/>
+      </w:pPr>
+      <w:r>
+        <w:rPr>
+          <w:rFonts w:ascii="Calibri" w:hAnsi="Calibri"/>
+          <w:color w:val="1E293B"/>
+          <w:sz w:val="20"/>
+        </w:rPr>
+        <w:t>Lucas Brown (Outback Cold Logistics) opens driver/deliveries.html. He accepts the shipment, clicks 'Mark Picked Up' at the cold depot, clicks 'Mark In Transit' along the highway, and clicks 'Mark Delivered' upon physical handover at 42 Elgin Street, Carlton VIC.</w:t>
+      </w:r>
+    </w:p>
+    <w:p>
+      <w:pPr>
+        <w:spacing w:before="160" w:after="60"/>
+        <w:jc w:val="center"/>
+      </w:pPr>
+      <w:r>
+        <w:drawing>
+          <wp:inline xmlns:a="http://schemas.openxmlformats.org/drawingml/2006/main" xmlns:pic="http://schemas.openxmlformats.org/drawingml/2006/picture">
+            <wp:extent cx="5486400" cy="3587262"/>
+            <wp:docPr id="22" name="Picture 22"/>
+            <wp:cNvGraphicFramePr>
+              <a:graphicFrameLocks noChangeAspect="1"/>
+            </wp:cNvGraphicFramePr>
+            <a:graphic>
+              <a:graphicData uri="http://schemas.openxmlformats.org/drawingml/2006/picture">
+                <pic:pic>
+                  <pic:nvPicPr>
+                    <pic:cNvPr id="0" name="flow_20_driver_dashboard.png"/>
+                    <pic:cNvPicPr/>
+                  </pic:nvPicPr>
+                  <pic:blipFill>
+                    <a:blip r:embed="rId30"/>
+                    <a:stretch>
+                      <a:fillRect/>
+                    </a:stretch>
+                  </pic:blipFill>
+                  <pic:spPr>
+                    <a:xfrm>
+                      <a:off x="0" y="0"/>
+                      <a:ext cx="5486400" cy="3587262"/>
+                    </a:xfrm>
+                    <a:prstGeom prst="rect"/>
+                  </pic:spPr>
+                </pic:pic>
+              </a:graphicData>
+            </a:graphic>
+          </wp:inline>
+        </w:drawing>
+      </w:r>
+    </w:p>
+    <w:p>
+      <w:pPr>
+        <w:spacing w:before="0" w:after="240"/>
+        <w:jc w:val="center"/>
+      </w:pPr>
+      <w:r>
+        <w:rPr>
+          <w:rFonts w:ascii="Calibri" w:hAnsi="Calibri"/>
+          <w:i/>
+          <w:color w:val="64748B"/>
+          <w:sz w:val="17"/>
+        </w:rPr>
+        <w:t>Figure: Flow 20: Logistics Driver Fleet Operations &amp; Route Telemetry</w:t>
+      </w:r>
+    </w:p>
+    <w:p>
+      <w:pPr>
+        <w:spacing w:before="160" w:after="60"/>
+        <w:jc w:val="center"/>
+      </w:pPr>
+      <w:r>
+        <w:drawing>
+          <wp:inline xmlns:a="http://schemas.openxmlformats.org/drawingml/2006/main" xmlns:pic="http://schemas.openxmlformats.org/drawingml/2006/picture">
+            <wp:extent cx="5486400" cy="3587262"/>
+            <wp:docPr id="23" name="Picture 23"/>
+            <wp:cNvGraphicFramePr>
+              <a:graphicFrameLocks noChangeAspect="1"/>
+            </wp:cNvGraphicFramePr>
+            <a:graphic>
+              <a:graphicData uri="http://schemas.openxmlformats.org/drawingml/2006/picture">
+                <pic:pic>
+                  <pic:nvPicPr>
+                    <pic:cNvPr id="0" name="flow_21_driver_deliveries_queue.png"/>
+                    <pic:cNvPicPr/>
+                  </pic:nvPicPr>
+                  <pic:blipFill>
+                    <a:blip r:embed="rId31"/>
+                    <a:stretch>
+                      <a:fillRect/>
+                    </a:stretch>
+                  </pic:blipFill>
+                  <pic:spPr>
+                    <a:xfrm>
+                      <a:off x="0" y="0"/>
+                      <a:ext cx="5486400" cy="3587262"/>
+                    </a:xfrm>
+                    <a:prstGeom prst="rect"/>
+                  </pic:spPr>
+                </pic:pic>
+              </a:graphicData>
+            </a:graphic>
+          </wp:inline>
+        </w:drawing>
+      </w:r>
+    </w:p>
+    <w:p>
+      <w:pPr>
+        <w:spacing w:before="0" w:after="240"/>
+        <w:jc w:val="center"/>
+      </w:pPr>
+      <w:r>
+        <w:rPr>
+          <w:rFonts w:ascii="Calibri" w:hAnsi="Calibri"/>
+          <w:i/>
+          <w:color w:val="64748B"/>
+          <w:sz w:val="17"/>
+        </w:rPr>
+        <w:t>Figure: Flow 21: Verified Shipment Ready for Cold-Chain Transit Pickup</w:t>
+      </w:r>
+    </w:p>
+    <w:p>
+      <w:pPr>
+        <w:spacing w:before="160" w:after="60"/>
+        <w:jc w:val="center"/>
+      </w:pPr>
+      <w:r>
+        <w:drawing>
+          <wp:inline xmlns:a="http://schemas.openxmlformats.org/drawingml/2006/main" xmlns:pic="http://schemas.openxmlformats.org/drawingml/2006/picture">
+            <wp:extent cx="5486400" cy="3587262"/>
+            <wp:docPr id="24" name="Picture 24"/>
+            <wp:cNvGraphicFramePr>
+              <a:graphicFrameLocks noChangeAspect="1"/>
+            </wp:cNvGraphicFramePr>
+            <a:graphic>
+              <a:graphicData uri="http://schemas.openxmlformats.org/drawingml/2006/picture">
+                <pic:pic>
+                  <pic:nvPicPr>
+                    <pic:cNvPr id="0" name="flow_22_driver_accepted.png"/>
+                    <pic:cNvPicPr/>
+                  </pic:nvPicPr>
+                  <pic:blipFill>
+                    <a:blip r:embed="rId32"/>
+                    <a:stretch>
+                      <a:fillRect/>
+                    </a:stretch>
+                  </pic:blipFill>
+                  <pic:spPr>
+                    <a:xfrm>
+                      <a:off x="0" y="0"/>
+                      <a:ext cx="5486400" cy="3587262"/>
+                    </a:xfrm>
+                    <a:prstGeom prst="rect"/>
+                  </pic:spPr>
+                </pic:pic>
+              </a:graphicData>
+            </a:graphic>
+          </wp:inline>
+        </w:drawing>
+      </w:r>
+    </w:p>
+    <w:p>
+      <w:pPr>
+        <w:spacing w:before="0" w:after="240"/>
+        <w:jc w:val="center"/>
+      </w:pPr>
+      <w:r>
+        <w:rPr>
+          <w:rFonts w:ascii="Calibri" w:hAnsi="Calibri"/>
+          <w:i/>
+          <w:color w:val="64748B"/>
+          <w:sz w:val="17"/>
+        </w:rPr>
+        <w:t>Figure: Flow 22: Shipment Assigned to Refrigerated Vehicle</w:t>
+      </w:r>
+    </w:p>
+    <w:p>
+      <w:pPr>
+        <w:spacing w:before="160" w:after="60"/>
+        <w:jc w:val="center"/>
+      </w:pPr>
+      <w:r>
+        <w:drawing>
+          <wp:inline xmlns:a="http://schemas.openxmlformats.org/drawingml/2006/main" xmlns:pic="http://schemas.openxmlformats.org/drawingml/2006/picture">
+            <wp:extent cx="5486400" cy="3587262"/>
+            <wp:docPr id="25" name="Picture 25"/>
+            <wp:cNvGraphicFramePr>
+              <a:graphicFrameLocks noChangeAspect="1"/>
+            </wp:cNvGraphicFramePr>
+            <a:graphic>
+              <a:graphicData uri="http://schemas.openxmlformats.org/drawingml/2006/picture">
+                <pic:pic>
+                  <pic:nvPicPr>
+                    <pic:cNvPr id="0" name="flow_23_driver_picked_up.png"/>
+                    <pic:cNvPicPr/>
+                  </pic:nvPicPr>
+                  <pic:blipFill>
+                    <a:blip r:embed="rId33"/>
+                    <a:stretch>
+                      <a:fillRect/>
+                    </a:stretch>
+                  </pic:blipFill>
+                  <pic:spPr>
+                    <a:xfrm>
+                      <a:off x="0" y="0"/>
+                      <a:ext cx="5486400" cy="3587262"/>
+                    </a:xfrm>
+                    <a:prstGeom prst="rect"/>
+                  </pic:spPr>
+                </pic:pic>
+              </a:graphicData>
+            </a:graphic>
+          </wp:inline>
+        </w:drawing>
+      </w:r>
+    </w:p>
+    <w:p>
+      <w:pPr>
+        <w:spacing w:before="0" w:after="240"/>
+        <w:jc w:val="center"/>
+      </w:pPr>
+      <w:r>
+        <w:rPr>
+          <w:rFonts w:ascii="Calibri" w:hAnsi="Calibri"/>
+          <w:i/>
+          <w:color w:val="64748B"/>
+          <w:sz w:val="17"/>
+        </w:rPr>
+        <w:t>Figure: Flow 23: Transit Checkpoint 1 Logged — Picked Up from Hub</w:t>
+      </w:r>
+    </w:p>
+    <w:p>
+      <w:pPr>
+        <w:spacing w:before="160" w:after="60"/>
+        <w:jc w:val="center"/>
+      </w:pPr>
+      <w:r>
+        <w:drawing>
+          <wp:inline xmlns:a="http://schemas.openxmlformats.org/drawingml/2006/main" xmlns:pic="http://schemas.openxmlformats.org/drawingml/2006/picture">
+            <wp:extent cx="5486400" cy="3587262"/>
+            <wp:docPr id="26" name="Picture 26"/>
+            <wp:cNvGraphicFramePr>
+              <a:graphicFrameLocks noChangeAspect="1"/>
+            </wp:cNvGraphicFramePr>
+            <a:graphic>
+              <a:graphicData uri="http://schemas.openxmlformats.org/drawingml/2006/picture">
+                <pic:pic>
+                  <pic:nvPicPr>
+                    <pic:cNvPr id="0" name="flow_24_driver_in_transit.png"/>
+                    <pic:cNvPicPr/>
+                  </pic:nvPicPr>
+                  <pic:blipFill>
+                    <a:blip r:embed="rId34"/>
+                    <a:stretch>
+                      <a:fillRect/>
+                    </a:stretch>
+                  </pic:blipFill>
+                  <pic:spPr>
+                    <a:xfrm>
+                      <a:off x="0" y="0"/>
+                      <a:ext cx="5486400" cy="3587262"/>
+                    </a:xfrm>
+                    <a:prstGeom prst="rect"/>
+                  </pic:spPr>
+                </pic:pic>
+              </a:graphicData>
+            </a:graphic>
+          </wp:inline>
+        </w:drawing>
+      </w:r>
+    </w:p>
+    <w:p>
+      <w:pPr>
+        <w:spacing w:before="0" w:after="240"/>
+        <w:jc w:val="center"/>
+      </w:pPr>
+      <w:r>
+        <w:rPr>
+          <w:rFonts w:ascii="Calibri" w:hAnsi="Calibri"/>
+          <w:i/>
+          <w:color w:val="64748B"/>
+          <w:sz w:val="17"/>
+        </w:rPr>
+        <w:t>Figure: Flow 24: Transit Checkpoint 2 Logged — In Transit on Regional Highway</w:t>
+      </w:r>
+    </w:p>
+    <w:p>
+      <w:pPr>
+        <w:spacing w:before="160" w:after="60"/>
+        <w:jc w:val="center"/>
+      </w:pPr>
+      <w:r>
+        <w:drawing>
+          <wp:inline xmlns:a="http://schemas.openxmlformats.org/drawingml/2006/main" xmlns:pic="http://schemas.openxmlformats.org/drawingml/2006/picture">
+            <wp:extent cx="5486400" cy="3587262"/>
+            <wp:docPr id="27" name="Picture 27"/>
+            <wp:cNvGraphicFramePr>
+              <a:graphicFrameLocks noChangeAspect="1"/>
+            </wp:cNvGraphicFramePr>
+            <a:graphic>
+              <a:graphicData uri="http://schemas.openxmlformats.org/drawingml/2006/picture">
+                <pic:pic>
+                  <pic:nvPicPr>
+                    <pic:cNvPr id="0" name="flow_25_driver_delivered.png"/>
+                    <pic:cNvPicPr/>
+                  </pic:nvPicPr>
+                  <pic:blipFill>
+                    <a:blip r:embed="rId35"/>
+                    <a:stretch>
+                      <a:fillRect/>
+                    </a:stretch>
+                  </pic:blipFill>
+                  <pic:spPr>
+                    <a:xfrm>
+                      <a:off x="0" y="0"/>
+                      <a:ext cx="5486400" cy="3587262"/>
+                    </a:xfrm>
+                    <a:prstGeom prst="rect"/>
+                  </pic:spPr>
+                </pic:pic>
+              </a:graphicData>
+            </a:graphic>
+          </wp:inline>
+        </w:drawing>
+      </w:r>
+    </w:p>
+    <w:p>
+      <w:pPr>
+        <w:spacing w:before="0" w:after="240"/>
+        <w:jc w:val="center"/>
+      </w:pPr>
+      <w:r>
+        <w:rPr>
+          <w:rFonts w:ascii="Calibri" w:hAnsi="Calibri"/>
+          <w:i/>
+          <w:color w:val="64748B"/>
+          <w:sz w:val="17"/>
+        </w:rPr>
+        <w:t>Figure: Flow 25: Transit Checkpoint 3 Handover Completed — Order Delivered</w:t>
+      </w:r>
+    </w:p>
+    <w:p>
+      <w:pPr>
+        <w:keepNext/>
+        <w:spacing w:before="280" w:after="80"/>
+      </w:pPr>
+      <w:r>
+        <w:rPr>
+          <w:rFonts w:ascii="Calibri" w:hAnsi="Calibri"/>
+          <w:b/>
+          <w:color w:val="2E7D32"/>
+          <w:sz w:val="26"/>
+        </w:rPr>
+        <w:t>Step 2.8: Customer Live Provenance Tracking &amp; Fair-Trade Rating</w:t>
+      </w:r>
+    </w:p>
+    <w:p>
+      <w:pPr>
+        <w:spacing w:before="0" w:after="120" w:line="276" w:lineRule="auto"/>
+      </w:pPr>
+      <w:r>
+        <w:rPr>
+          <w:rFonts w:ascii="Calibri" w:hAnsi="Calibri"/>
+          <w:color w:val="1E293B"/>
+          <w:sz w:val="20"/>
+        </w:rPr>
+        <w:t>Chloe Taylor opens customer/orders.html. All 7 progress stages are now illuminated green. She navigates to customer/feedback.html and submits a 5-star rating praising Jack Miller's fresh Barossa Valley grapes.</w:t>
+      </w:r>
+    </w:p>
+    <w:p>
+      <w:pPr>
+        <w:spacing w:before="160" w:after="60"/>
+        <w:jc w:val="center"/>
+      </w:pPr>
+      <w:r>
+        <w:drawing>
+          <wp:inline xmlns:a="http://schemas.openxmlformats.org/drawingml/2006/main" xmlns:pic="http://schemas.openxmlformats.org/drawingml/2006/picture">
+            <wp:extent cx="5486400" cy="3587262"/>
+            <wp:docPr id="28" name="Picture 28"/>
+            <wp:cNvGraphicFramePr>
+              <a:graphicFrameLocks noChangeAspect="1"/>
+            </wp:cNvGraphicFramePr>
+            <a:graphic>
+              <a:graphicData uri="http://schemas.openxmlformats.org/drawingml/2006/picture">
+                <pic:pic>
+                  <pic:nvPicPr>
+                    <pic:cNvPr id="0" name="flow_09_customer_order_tracking_step1.png"/>
+                    <pic:cNvPicPr/>
+                  </pic:nvPicPr>
+                  <pic:blipFill>
+                    <a:blip r:embed="rId20"/>
+                    <a:stretch>
+                      <a:fillRect/>
+                    </a:stretch>
+                  </pic:blipFill>
+                  <pic:spPr>
+                    <a:xfrm>
+                      <a:off x="0" y="0"/>
+                      <a:ext cx="5486400" cy="3587262"/>
+                    </a:xfrm>
+                    <a:prstGeom prst="rect"/>
+                  </pic:spPr>
+                </pic:pic>
+              </a:graphicData>
+            </a:graphic>
+          </wp:inline>
+        </w:drawing>
+      </w:r>
+    </w:p>
+    <w:p>
+      <w:pPr>
+        <w:spacing w:before="0" w:after="240"/>
+        <w:jc w:val="center"/>
+      </w:pPr>
+      <w:r>
+        <w:rPr>
+          <w:rFonts w:ascii="Calibri" w:hAnsi="Calibri"/>
+          <w:i/>
+          <w:color w:val="64748B"/>
+          <w:sz w:val="17"/>
+        </w:rPr>
+        <w:t>Figure: Flow 26: 7-Stage Custody Tracker Displaying Complete Green Delivered Milestones</w:t>
+      </w:r>
+    </w:p>
+    <w:p>
+      <w:pPr>
+        <w:spacing w:before="160" w:after="60"/>
+        <w:jc w:val="center"/>
+      </w:pPr>
+      <w:r>
+        <w:drawing>
+          <wp:inline xmlns:a="http://schemas.openxmlformats.org/drawingml/2006/main" xmlns:pic="http://schemas.openxmlformats.org/drawingml/2006/picture">
+            <wp:extent cx="5486400" cy="3587262"/>
+            <wp:docPr id="29" name="Picture 29"/>
+            <wp:cNvGraphicFramePr>
+              <a:graphicFrameLocks noChangeAspect="1"/>
+            </wp:cNvGraphicFramePr>
+            <a:graphic>
+              <a:graphicData uri="http://schemas.openxmlformats.org/drawingml/2006/picture">
+                <pic:pic>
+                  <pic:nvPicPr>
+                    <pic:cNvPr id="0" name="flow_27_customer_feedback_form.png"/>
+                    <pic:cNvPicPr/>
+                  </pic:nvPicPr>
+                  <pic:blipFill>
+                    <a:blip r:embed="rId36"/>
+                    <a:stretch>
+                      <a:fillRect/>
+                    </a:stretch>
+                  </pic:blipFill>
+                  <pic:spPr>
+                    <a:xfrm>
+                      <a:off x="0" y="0"/>
+                      <a:ext cx="5486400" cy="3587262"/>
+                    </a:xfrm>
+                    <a:prstGeom prst="rect"/>
+                  </pic:spPr>
+                </pic:pic>
+              </a:graphicData>
+            </a:graphic>
+          </wp:inline>
+        </w:drawing>
+      </w:r>
+    </w:p>
+    <w:p>
+      <w:pPr>
+        <w:spacing w:before="0" w:after="240"/>
+        <w:jc w:val="center"/>
+      </w:pPr>
+      <w:r>
+        <w:rPr>
+          <w:rFonts w:ascii="Calibri" w:hAnsi="Calibri"/>
+          <w:i/>
+          <w:color w:val="64748B"/>
+          <w:sz w:val="17"/>
+        </w:rPr>
+        <w:t>Figure: Flow 27: Fair-Trade Farmer Quality Rating and Review Submission Workspace</w:t>
+      </w:r>
+    </w:p>
+    <w:p>
+      <w:pPr>
+        <w:spacing w:before="160" w:after="60"/>
+        <w:jc w:val="center"/>
+      </w:pPr>
+      <w:r>
+        <w:drawing>
+          <wp:inline xmlns:a="http://schemas.openxmlformats.org/drawingml/2006/main" xmlns:pic="http://schemas.openxmlformats.org/drawingml/2006/picture">
+            <wp:extent cx="5486400" cy="3587262"/>
+            <wp:docPr id="30" name="Picture 30"/>
+            <wp:cNvGraphicFramePr>
+              <a:graphicFrameLocks noChangeAspect="1"/>
+            </wp:cNvGraphicFramePr>
+            <a:graphic>
+              <a:graphicData uri="http://schemas.openxmlformats.org/drawingml/2006/picture">
+                <pic:pic>
+                  <pic:nvPicPr>
+                    <pic:cNvPr id="0" name="flow_09_customer_order_tracking_step1.png"/>
+                    <pic:cNvPicPr/>
+                  </pic:nvPicPr>
+                  <pic:blipFill>
+                    <a:blip r:embed="rId20"/>
+                    <a:stretch>
+                      <a:fillRect/>
+                    </a:stretch>
+                  </pic:blipFill>
+                  <pic:spPr>
+                    <a:xfrm>
+                      <a:off x="0" y="0"/>
+                      <a:ext cx="5486400" cy="3587262"/>
+                    </a:xfrm>
+                    <a:prstGeom prst="rect"/>
+                  </pic:spPr>
+                </pic:pic>
+              </a:graphicData>
+            </a:graphic>
+          </wp:inline>
+        </w:drawing>
+      </w:r>
+    </w:p>
+    <w:p>
+      <w:pPr>
+        <w:spacing w:before="0" w:after="240"/>
+        <w:jc w:val="center"/>
+      </w:pPr>
+      <w:r>
+        <w:rPr>
+          <w:rFonts w:ascii="Calibri" w:hAnsi="Calibri"/>
+          <w:i/>
+          <w:color w:val="64748B"/>
+          <w:sz w:val="17"/>
+        </w:rPr>
+        <w:t>Figure: Flow 28: 5-Star Farmer Feedback Successfully Committed to Grower Profile</w:t>
+      </w:r>
+    </w:p>
+    <w:p>
+      <w:pPr>
+        <w:keepNext/>
+        <w:spacing w:before="280" w:after="80"/>
+      </w:pPr>
+      <w:r>
+        <w:rPr>
+          <w:rFonts w:ascii="Calibri" w:hAnsi="Calibri"/>
+          <w:b/>
+          <w:color w:val="2E7D32"/>
+          <w:sz w:val="26"/>
+        </w:rPr>
+        <w:t>Step 2.9: Admin Master Audit Ledger &amp; Financial Telemetry</w:t>
+      </w:r>
+    </w:p>
+    <w:p>
+      <w:pPr>
+        <w:spacing w:before="0" w:after="120" w:line="276" w:lineRule="auto"/>
+      </w:pPr>
+      <w:r>
+        <w:rPr>
+          <w:rFonts w:ascii="Calibri" w:hAnsi="Calibri"/>
+          <w:color w:val="1E293B"/>
+          <w:sz w:val="20"/>
+        </w:rPr>
+        <w:t>The Administrator audits the platform: inspecting the master transaction ledger, stakeholder user directory, global biosecurity catalog, and commercial financial evaluation metrics in AUD.</w:t>
+      </w:r>
+    </w:p>
+    <w:p>
+      <w:pPr>
+        <w:spacing w:before="160" w:after="60"/>
+        <w:jc w:val="center"/>
+      </w:pPr>
+      <w:r>
+        <w:drawing>
+          <wp:inline xmlns:a="http://schemas.openxmlformats.org/drawingml/2006/main" xmlns:pic="http://schemas.openxmlformats.org/drawingml/2006/picture">
+            <wp:extent cx="5486400" cy="3587262"/>
+            <wp:docPr id="31" name="Picture 31"/>
+            <wp:cNvGraphicFramePr>
+              <a:graphicFrameLocks noChangeAspect="1"/>
+            </wp:cNvGraphicFramePr>
+            <a:graphic>
+              <a:graphicData uri="http://schemas.openxmlformats.org/drawingml/2006/picture">
+                <pic:pic>
+                  <pic:nvPicPr>
+                    <pic:cNvPr id="0" name="flow_29_admin_orders_master_ledger.png"/>
+                    <pic:cNvPicPr/>
+                  </pic:nvPicPr>
+                  <pic:blipFill>
+                    <a:blip r:embed="rId37"/>
+                    <a:stretch>
+                      <a:fillRect/>
+                    </a:stretch>
+                  </pic:blipFill>
+                  <pic:spPr>
+                    <a:xfrm>
+                      <a:off x="0" y="0"/>
+                      <a:ext cx="5486400" cy="3587262"/>
+                    </a:xfrm>
+                    <a:prstGeom prst="rect"/>
+                  </pic:spPr>
+                </pic:pic>
+              </a:graphicData>
+            </a:graphic>
+          </wp:inline>
+        </w:drawing>
+      </w:r>
+    </w:p>
+    <w:p>
+      <w:pPr>
+        <w:spacing w:before="0" w:after="240"/>
+        <w:jc w:val="center"/>
+      </w:pPr>
+      <w:r>
+        <w:rPr>
+          <w:rFonts w:ascii="Calibri" w:hAnsi="Calibri"/>
+          <w:i/>
+          <w:color w:val="64748B"/>
+          <w:sz w:val="17"/>
+        </w:rPr>
+        <w:t>Figure: Flow 29: Master Order Transaction Audit Ledger with Delivered Transaction Record</w:t>
+      </w:r>
+    </w:p>
+    <w:p>
+      <w:pPr>
+        <w:spacing w:before="160" w:after="60"/>
+        <w:jc w:val="center"/>
+      </w:pPr>
+      <w:r>
+        <w:drawing>
+          <wp:inline xmlns:a="http://schemas.openxmlformats.org/drawingml/2006/main" xmlns:pic="http://schemas.openxmlformats.org/drawingml/2006/picture">
+            <wp:extent cx="5486400" cy="3587262"/>
+            <wp:docPr id="32" name="Picture 32"/>
+            <wp:cNvGraphicFramePr>
+              <a:graphicFrameLocks noChangeAspect="1"/>
+            </wp:cNvGraphicFramePr>
+            <a:graphic>
+              <a:graphicData uri="http://schemas.openxmlformats.org/drawingml/2006/picture">
+                <pic:pic>
+                  <pic:nvPicPr>
+                    <pic:cNvPr id="0" name="flow_30_admin_users_stakeholders.png"/>
+                    <pic:cNvPicPr/>
+                  </pic:nvPicPr>
+                  <pic:blipFill>
+                    <a:blip r:embed="rId38"/>
+                    <a:stretch>
+                      <a:fillRect/>
+                    </a:stretch>
+                  </pic:blipFill>
+                  <pic:spPr>
+                    <a:xfrm>
+                      <a:off x="0" y="0"/>
+                      <a:ext cx="5486400" cy="3587262"/>
+                    </a:xfrm>
+                    <a:prstGeom prst="rect"/>
+                  </pic:spPr>
+                </pic:pic>
+              </a:graphicData>
+            </a:graphic>
+          </wp:inline>
+        </w:drawing>
+      </w:r>
+    </w:p>
+    <w:p>
+      <w:pPr>
+        <w:spacing w:before="0" w:after="240"/>
+        <w:jc w:val="center"/>
+      </w:pPr>
+      <w:r>
+        <w:rPr>
+          <w:rFonts w:ascii="Calibri" w:hAnsi="Calibri"/>
+          <w:i/>
+          <w:color w:val="64748B"/>
+          <w:sz w:val="17"/>
+        </w:rPr>
+        <w:t>Figure: Flow 30: Master Stakeholder Registry Across Australian Agricultural Nodes</w:t>
+      </w:r>
+    </w:p>
+    <w:p>
+      <w:pPr>
+        <w:spacing w:before="160" w:after="60"/>
+        <w:jc w:val="center"/>
+      </w:pPr>
+      <w:r>
+        <w:drawing>
+          <wp:inline xmlns:a="http://schemas.openxmlformats.org/drawingml/2006/main" xmlns:pic="http://schemas.openxmlformats.org/drawingml/2006/picture">
+            <wp:extent cx="5486400" cy="3587262"/>
+            <wp:docPr id="33" name="Picture 33"/>
+            <wp:cNvGraphicFramePr>
+              <a:graphicFrameLocks noChangeAspect="1"/>
+            </wp:cNvGraphicFramePr>
+            <a:graphic>
+              <a:graphicData uri="http://schemas.openxmlformats.org/drawingml/2006/picture">
+                <pic:pic>
+                  <pic:nvPicPr>
+                    <pic:cNvPr id="0" name="flow_31_admin_products_audit.png"/>
+                    <pic:cNvPicPr/>
+                  </pic:nvPicPr>
+                  <pic:blipFill>
+                    <a:blip r:embed="rId39"/>
+                    <a:stretch>
+                      <a:fillRect/>
+                    </a:stretch>
+                  </pic:blipFill>
+                  <pic:spPr>
+                    <a:xfrm>
+                      <a:off x="0" y="0"/>
+                      <a:ext cx="5486400" cy="3587262"/>
+                    </a:xfrm>
+                    <a:prstGeom prst="rect"/>
+                  </pic:spPr>
+                </pic:pic>
+              </a:graphicData>
+            </a:graphic>
+          </wp:inline>
+        </w:drawing>
+      </w:r>
+    </w:p>
+    <w:p>
+      <w:pPr>
+        <w:spacing w:before="0" w:after="240"/>
+        <w:jc w:val="center"/>
+      </w:pPr>
+      <w:r>
+        <w:rPr>
+          <w:rFonts w:ascii="Calibri" w:hAnsi="Calibri"/>
+          <w:i/>
+          <w:color w:val="64748B"/>
+          <w:sz w:val="17"/>
+        </w:rPr>
+        <w:t>Figure: Flow 31: Global Produce Catalog Audit with Barossa Valley Grapes Listed</w:t>
+      </w:r>
+    </w:p>
+    <w:p>
+      <w:pPr>
+        <w:spacing w:before="160" w:after="60"/>
+        <w:jc w:val="center"/>
+      </w:pPr>
+      <w:r>
+        <w:drawing>
+          <wp:inline xmlns:a="http://schemas.openxmlformats.org/drawingml/2006/main" xmlns:pic="http://schemas.openxmlformats.org/drawingml/2006/picture">
+            <wp:extent cx="5486400" cy="3587262"/>
+            <wp:docPr id="34" name="Picture 34"/>
+            <wp:cNvGraphicFramePr>
+              <a:graphicFrameLocks noChangeAspect="1"/>
+            </wp:cNvGraphicFramePr>
+            <a:graphic>
+              <a:graphicData uri="http://schemas.openxmlformats.org/drawingml/2006/picture">
+                <pic:pic>
+                  <pic:nvPicPr>
+                    <pic:cNvPr id="0" name="flow_32_admin_evaluation_financials.png"/>
+                    <pic:cNvPicPr/>
+                  </pic:nvPicPr>
+                  <pic:blipFill>
+                    <a:blip r:embed="rId40"/>
+                    <a:stretch>
+                      <a:fillRect/>
+                    </a:stretch>
+                  </pic:blipFill>
+                  <pic:spPr>
+                    <a:xfrm>
+                      <a:off x="0" y="0"/>
+                      <a:ext cx="5486400" cy="3587262"/>
+                    </a:xfrm>
+                    <a:prstGeom prst="rect"/>
+                  </pic:spPr>
+                </pic:pic>
+              </a:graphicData>
+            </a:graphic>
+          </wp:inline>
+        </w:drawing>
+      </w:r>
+    </w:p>
+    <w:p>
+      <w:pPr>
+        <w:spacing w:before="0" w:after="240"/>
+        <w:jc w:val="center"/>
+      </w:pPr>
+      <w:r>
+        <w:rPr>
+          <w:rFonts w:ascii="Calibri" w:hAnsi="Calibri"/>
+          <w:i/>
+          <w:color w:val="64748B"/>
+          <w:sz w:val="17"/>
+        </w:rPr>
+        <w:t>Figure: Flow 32: Administrative Commercial Evaluation &amp; Revenue Feasibility Telemetry</w:t>
+      </w:r>
+    </w:p>
+    <w:p>
+      <w:pPr>
+        <w:keepNext/>
+        <w:spacing w:before="360" w:after="120"/>
+      </w:pPr>
+      <w:r>
+        <w:rPr>
+          <w:rFonts w:ascii="Calibri" w:hAnsi="Calibri"/>
+          <w:b/>
+          <w:color w:val="1B4D20"/>
+          <w:sz w:val="32"/>
+        </w:rPr>
+        <w:t>3. Detailed Portal Reference &amp; Stakeholder Procedures</w:t>
+      </w:r>
+    </w:p>
+    <w:p>
+      <w:pPr>
+        <w:spacing w:before="0" w:after="120" w:line="276" w:lineRule="auto"/>
+      </w:pPr>
+      <w:r>
+        <w:rPr>
+          <w:rFonts w:ascii="Calibri" w:hAnsi="Calibri"/>
+          <w:color w:val="1E293B"/>
+          <w:sz w:val="20"/>
+        </w:rPr>
+        <w:t>This section details dedicated procedures, account setups, and role-specific permissions across each independent web portal.</w:t>
+      </w:r>
+    </w:p>
+    <w:p>
+      <w:pPr>
+        <w:keepNext/>
+        <w:spacing w:before="280" w:after="80"/>
+      </w:pPr>
+      <w:r>
+        <w:rPr>
+          <w:rFonts w:ascii="Calibri" w:hAnsi="Calibri"/>
+          <w:b/>
+          <w:color w:val="2E7D32"/>
+          <w:sz w:val="26"/>
+        </w:rPr>
+        <w:t>3.1 Authentication &amp; 1-Click Demo Bar (login.html)</w:t>
+      </w:r>
     </w:p>
     <w:tbl>
       <w:tblPr>
@@ -2396,840 +4074,6 @@
         <w:spacing w:after="160"/>
       </w:pPr>
     </w:p>
-    <w:p>
-      <w:pPr>
-        <w:spacing w:before="160" w:after="60"/>
-        <w:jc w:val="center"/>
-      </w:pPr>
-      <w:r>
-        <w:drawing>
-          <wp:inline xmlns:a="http://schemas.openxmlformats.org/drawingml/2006/main" xmlns:pic="http://schemas.openxmlformats.org/drawingml/2006/picture">
-            <wp:extent cx="5486400" cy="3587262"/>
-            <wp:docPr id="5" name="Picture 5"/>
-            <wp:cNvGraphicFramePr>
-              <a:graphicFrameLocks noChangeAspect="1"/>
-            </wp:cNvGraphicFramePr>
-            <a:graphic>
-              <a:graphicData uri="http://schemas.openxmlformats.org/drawingml/2006/picture">
-                <pic:pic>
-                  <pic:nvPicPr>
-                    <pic:cNvPr id="0" name="portal_02_login_page.png"/>
-                    <pic:cNvPicPr/>
-                  </pic:nvPicPr>
-                  <pic:blipFill>
-                    <a:blip r:embed="rId15"/>
-                    <a:stretch>
-                      <a:fillRect/>
-                    </a:stretch>
-                  </pic:blipFill>
-                  <pic:spPr>
-                    <a:xfrm>
-                      <a:off x="0" y="0"/>
-                      <a:ext cx="5486400" cy="3587262"/>
-                    </a:xfrm>
-                    <a:prstGeom prst="rect"/>
-                  </pic:spPr>
-                </pic:pic>
-              </a:graphicData>
-            </a:graphic>
-          </wp:inline>
-        </w:drawing>
-      </w:r>
-    </w:p>
-    <w:p>
-      <w:pPr>
-        <w:spacing w:before="0" w:after="240"/>
-        <w:jc w:val="center"/>
-      </w:pPr>
-      <w:r>
-        <w:rPr>
-          <w:rFonts w:ascii="Calibri" w:hAnsi="Calibri"/>
-          <w:i/>
-          <w:color w:val="64748B"/>
-          <w:sz w:val="17"/>
-        </w:rPr>
-        <w:t>Figure: Figure 2.3: Authentication Login Portal with Integrated 1-Click Demo Toolbar and Form Validation</w:t>
-      </w:r>
-    </w:p>
-    <w:p>
-      <w:pPr>
-        <w:keepNext/>
-        <w:spacing w:before="360" w:after="120"/>
-      </w:pPr>
-      <w:r>
-        <w:rPr>
-          <w:rFonts w:ascii="Calibri" w:hAnsi="Calibri"/>
-          <w:b/>
-          <w:color w:val="1B4D20"/>
-          <w:sz w:val="32"/>
-        </w:rPr>
-        <w:t>3. Small Farmer Operations Manual (farmer/)</w:t>
-      </w:r>
-    </w:p>
-    <w:p>
-      <w:pPr>
-        <w:spacing w:before="0" w:after="120" w:line="276" w:lineRule="auto"/>
-      </w:pPr>
-      <w:r>
-        <w:rPr>
-          <w:rFonts w:ascii="Calibri" w:hAnsi="Calibri"/>
-          <w:color w:val="1E293B"/>
-          <w:sz w:val="20"/>
-        </w:rPr>
-        <w:t>The Farmer Portal provides small producers, family-run orchards, and regional agricultural cooperatives with direct market access, eliminating middlemen broker commissions. Growers control their own produce catalog, publish seasonal harvest batches in AUD, and track inbound purchase orders in real time.</w:t>
-      </w:r>
-    </w:p>
-    <w:p>
-      <w:pPr>
-        <w:keepNext/>
-        <w:spacing w:before="280" w:after="80"/>
-      </w:pPr>
-      <w:r>
-        <w:rPr>
-          <w:rFonts w:ascii="Calibri" w:hAnsi="Calibri"/>
-          <w:b/>
-          <w:color w:val="2E7D32"/>
-          <w:sz w:val="26"/>
-        </w:rPr>
-        <w:t>3.1 Farmer Operations Dashboard (farmer/dashboard.html)</w:t>
-      </w:r>
-    </w:p>
-    <w:p>
-      <w:pPr>
-        <w:spacing w:before="0" w:after="120" w:line="276" w:lineRule="auto"/>
-      </w:pPr>
-      <w:r>
-        <w:rPr>
-          <w:rFonts w:ascii="Calibri" w:hAnsi="Calibri"/>
-          <w:color w:val="1E293B"/>
-          <w:sz w:val="20"/>
-        </w:rPr>
-        <w:t>Upon successful login, the farmer lands on their central telemetry dashboard displaying real-time metrics:</w:t>
-      </w:r>
-    </w:p>
-    <w:p>
-      <w:pPr>
-        <w:pStyle w:val="ListBullet"/>
-        <w:spacing w:before="0" w:after="60" w:line="276" w:lineRule="auto"/>
-      </w:pPr>
-      <w:r>
-        <w:rPr>
-          <w:rFonts w:ascii="Calibri" w:hAnsi="Calibri"/>
-          <w:b/>
-          <w:color w:val="1E293B"/>
-          <w:sz w:val="20"/>
-        </w:rPr>
-        <w:t xml:space="preserve">• </w:t>
-      </w:r>
-      <w:r>
-        <w:rPr>
-          <w:rFonts w:ascii="Calibri" w:hAnsi="Calibri"/>
-          <w:color w:val="1E293B"/>
-          <w:sz w:val="20"/>
-        </w:rPr>
-        <w:t>Active Produce Listings: Total harvest batches currently live on the public marketplace.</w:t>
-      </w:r>
-    </w:p>
-    <w:p>
-      <w:pPr>
-        <w:pStyle w:val="ListBullet"/>
-        <w:spacing w:before="0" w:after="60" w:line="276" w:lineRule="auto"/>
-      </w:pPr>
-      <w:r>
-        <w:rPr>
-          <w:rFonts w:ascii="Calibri" w:hAnsi="Calibri"/>
-          <w:b/>
-          <w:color w:val="1E293B"/>
-          <w:sz w:val="20"/>
-        </w:rPr>
-        <w:t xml:space="preserve">• </w:t>
-      </w:r>
-      <w:r>
-        <w:rPr>
-          <w:rFonts w:ascii="Calibri" w:hAnsi="Calibri"/>
-          <w:color w:val="1E293B"/>
-          <w:sz w:val="20"/>
-        </w:rPr>
-        <w:t>Pending Inbound Orders: Orders placed by consumers awaiting harvest and packaging confirmation.</w:t>
-      </w:r>
-    </w:p>
-    <w:p>
-      <w:pPr>
-        <w:pStyle w:val="ListBullet"/>
-        <w:spacing w:before="0" w:after="60" w:line="276" w:lineRule="auto"/>
-      </w:pPr>
-      <w:r>
-        <w:rPr>
-          <w:rFonts w:ascii="Calibri" w:hAnsi="Calibri"/>
-          <w:b/>
-          <w:color w:val="1E293B"/>
-          <w:sz w:val="20"/>
-        </w:rPr>
-        <w:t xml:space="preserve">• </w:t>
-      </w:r>
-      <w:r>
-        <w:rPr>
-          <w:rFonts w:ascii="Calibri" w:hAnsi="Calibri"/>
-          <w:color w:val="1E293B"/>
-          <w:sz w:val="20"/>
-        </w:rPr>
-        <w:t>Gross Farm Revenue ($ AUD): Total cumulative funds earned from fulfilled orders.</w:t>
-      </w:r>
-    </w:p>
-    <w:p>
-      <w:pPr>
-        <w:pStyle w:val="ListBullet"/>
-        <w:spacing w:before="0" w:after="60" w:line="276" w:lineRule="auto"/>
-      </w:pPr>
-      <w:r>
-        <w:rPr>
-          <w:rFonts w:ascii="Calibri" w:hAnsi="Calibri"/>
-          <w:b/>
-          <w:color w:val="1E293B"/>
-          <w:sz w:val="20"/>
-        </w:rPr>
-        <w:t xml:space="preserve">• </w:t>
-      </w:r>
-      <w:r>
-        <w:rPr>
-          <w:rFonts w:ascii="Calibri" w:hAnsi="Calibri"/>
-          <w:color w:val="1E293B"/>
-          <w:sz w:val="20"/>
-        </w:rPr>
-        <w:t>Operational Quick Links: Direct navigation to batch creation and fulfillment queues.</w:t>
-      </w:r>
-    </w:p>
-    <w:p>
-      <w:pPr>
-        <w:spacing w:before="160" w:after="60"/>
-        <w:jc w:val="center"/>
-      </w:pPr>
-      <w:r>
-        <w:drawing>
-          <wp:inline xmlns:a="http://schemas.openxmlformats.org/drawingml/2006/main" xmlns:pic="http://schemas.openxmlformats.org/drawingml/2006/picture">
-            <wp:extent cx="5486400" cy="3587262"/>
-            <wp:docPr id="6" name="Picture 6"/>
-            <wp:cNvGraphicFramePr>
-              <a:graphicFrameLocks noChangeAspect="1"/>
-            </wp:cNvGraphicFramePr>
-            <a:graphic>
-              <a:graphicData uri="http://schemas.openxmlformats.org/drawingml/2006/picture">
-                <pic:pic>
-                  <pic:nvPicPr>
-                    <pic:cNvPr id="0" name="farmer_01_dashboard.png"/>
-                    <pic:cNvPicPr/>
-                  </pic:nvPicPr>
-                  <pic:blipFill>
-                    <a:blip r:embed="rId16"/>
-                    <a:stretch>
-                      <a:fillRect/>
-                    </a:stretch>
-                  </pic:blipFill>
-                  <pic:spPr>
-                    <a:xfrm>
-                      <a:off x="0" y="0"/>
-                      <a:ext cx="5486400" cy="3587262"/>
-                    </a:xfrm>
-                    <a:prstGeom prst="rect"/>
-                  </pic:spPr>
-                </pic:pic>
-              </a:graphicData>
-            </a:graphic>
-          </wp:inline>
-        </w:drawing>
-      </w:r>
-    </w:p>
-    <w:p>
-      <w:pPr>
-        <w:spacing w:before="0" w:after="240"/>
-        <w:jc w:val="center"/>
-      </w:pPr>
-      <w:r>
-        <w:rPr>
-          <w:rFonts w:ascii="Calibri" w:hAnsi="Calibri"/>
-          <w:i/>
-          <w:color w:val="64748B"/>
-          <w:sz w:val="17"/>
-        </w:rPr>
-        <w:t>Figure: Figure 3.1: Farmer Operations Command Center &amp; Inventory Telemetry (Jack Miller, Yarra Valley VIC)</w:t>
-      </w:r>
-    </w:p>
-    <w:p>
-      <w:pPr>
-        <w:keepNext/>
-        <w:spacing w:before="280" w:after="80"/>
-      </w:pPr>
-      <w:r>
-        <w:rPr>
-          <w:rFonts w:ascii="Calibri" w:hAnsi="Calibri"/>
-          <w:b/>
-          <w:color w:val="2E7D32"/>
-          <w:sz w:val="26"/>
-        </w:rPr>
-        <w:t>3.2 Listing Fresh Harvest Batches (farmer/products.html)</w:t>
-      </w:r>
-    </w:p>
-    <w:p>
-      <w:pPr>
-        <w:spacing w:before="0" w:after="120" w:line="276" w:lineRule="auto"/>
-      </w:pPr>
-      <w:r>
-        <w:rPr>
-          <w:rFonts w:ascii="Calibri" w:hAnsi="Calibri"/>
-          <w:color w:val="1E293B"/>
-          <w:sz w:val="20"/>
-        </w:rPr>
-        <w:t>To publish a new harvest batch to the marketplace, the farmer follows these sequential steps:</w:t>
-      </w:r>
-    </w:p>
-    <w:p>
-      <w:pPr>
-        <w:pStyle w:val="ListBullet"/>
-        <w:spacing w:before="0" w:after="60" w:line="276" w:lineRule="auto"/>
-      </w:pPr>
-      <w:r>
-        <w:rPr>
-          <w:rFonts w:ascii="Calibri" w:hAnsi="Calibri"/>
-          <w:b/>
-          <w:color w:val="1E293B"/>
-          <w:sz w:val="20"/>
-        </w:rPr>
-        <w:t xml:space="preserve">Step 1: </w:t>
-      </w:r>
-      <w:r>
-        <w:rPr>
-          <w:rFonts w:ascii="Calibri" w:hAnsi="Calibri"/>
-          <w:color w:val="1E293B"/>
-          <w:sz w:val="20"/>
-        </w:rPr>
-        <w:t>Navigate to 'Produce Catalog' (farmer/products.html) from the sidebar.</w:t>
-      </w:r>
-    </w:p>
-    <w:p>
-      <w:pPr>
-        <w:pStyle w:val="ListBullet"/>
-        <w:spacing w:before="0" w:after="60" w:line="276" w:lineRule="auto"/>
-      </w:pPr>
-      <w:r>
-        <w:rPr>
-          <w:rFonts w:ascii="Calibri" w:hAnsi="Calibri"/>
-          <w:b/>
-          <w:color w:val="1E293B"/>
-          <w:sz w:val="20"/>
-        </w:rPr>
-        <w:t xml:space="preserve">Step 2: </w:t>
-      </w:r>
-      <w:r>
-        <w:rPr>
-          <w:rFonts w:ascii="Calibri" w:hAnsi="Calibri"/>
-          <w:color w:val="1E293B"/>
-          <w:sz w:val="20"/>
-        </w:rPr>
-        <w:t>Click the '+ Add Produce' action button to trigger the modal dialog.</w:t>
-      </w:r>
-    </w:p>
-    <w:p>
-      <w:pPr>
-        <w:pStyle w:val="ListBullet"/>
-        <w:spacing w:before="0" w:after="60" w:line="276" w:lineRule="auto"/>
-      </w:pPr>
-      <w:r>
-        <w:rPr>
-          <w:rFonts w:ascii="Calibri" w:hAnsi="Calibri"/>
-          <w:b/>
-          <w:color w:val="1E293B"/>
-          <w:sz w:val="20"/>
-        </w:rPr>
-        <w:t xml:space="preserve">Step 3: </w:t>
-      </w:r>
-      <w:r>
-        <w:rPr>
-          <w:rFonts w:ascii="Calibri" w:hAnsi="Calibri"/>
-          <w:color w:val="1E293B"/>
-          <w:sz w:val="20"/>
-        </w:rPr>
-        <w:t>Input Produce Name (e.g. 'Yarra Valley Organic Strawberries') and select Category (Fruits, Vegetables, Grains).</w:t>
-      </w:r>
-    </w:p>
-    <w:p>
-      <w:pPr>
-        <w:pStyle w:val="ListBullet"/>
-        <w:spacing w:before="0" w:after="60" w:line="276" w:lineRule="auto"/>
-      </w:pPr>
-      <w:r>
-        <w:rPr>
-          <w:rFonts w:ascii="Calibri" w:hAnsi="Calibri"/>
-          <w:b/>
-          <w:color w:val="1E293B"/>
-          <w:sz w:val="20"/>
-        </w:rPr>
-        <w:t xml:space="preserve">Step 4: </w:t>
-      </w:r>
-      <w:r>
-        <w:rPr>
-          <w:rFonts w:ascii="Calibri" w:hAnsi="Calibri"/>
-          <w:color w:val="1E293B"/>
-          <w:sz w:val="20"/>
-        </w:rPr>
-        <w:t>Specify Farm-Gate Price ($ AUD) and Unit of Measure (kg, punnet, bunch, box).</w:t>
-      </w:r>
-    </w:p>
-    <w:p>
-      <w:pPr>
-        <w:pStyle w:val="ListBullet"/>
-        <w:spacing w:before="0" w:after="60" w:line="276" w:lineRule="auto"/>
-      </w:pPr>
-      <w:r>
-        <w:rPr>
-          <w:rFonts w:ascii="Calibri" w:hAnsi="Calibri"/>
-          <w:b/>
-          <w:color w:val="1E293B"/>
-          <w:sz w:val="20"/>
-        </w:rPr>
-        <w:t xml:space="preserve">Step 5: </w:t>
-      </w:r>
-      <w:r>
-        <w:rPr>
-          <w:rFonts w:ascii="Calibri" w:hAnsi="Calibri"/>
-          <w:color w:val="1E293B"/>
-          <w:sz w:val="20"/>
-        </w:rPr>
-        <w:t>Enter Total Batch Quantity available (e.g. 120 punnets) and Farm Origin (e.g. 'Coldstream, Yarra Valley VIC').</w:t>
-      </w:r>
-    </w:p>
-    <w:p>
-      <w:pPr>
-        <w:pStyle w:val="ListBullet"/>
-        <w:spacing w:before="0" w:after="60" w:line="276" w:lineRule="auto"/>
-      </w:pPr>
-      <w:r>
-        <w:rPr>
-          <w:rFonts w:ascii="Calibri" w:hAnsi="Calibri"/>
-          <w:b/>
-          <w:color w:val="1E293B"/>
-          <w:sz w:val="20"/>
-        </w:rPr>
-        <w:t xml:space="preserve">Step 6: </w:t>
-      </w:r>
-      <w:r>
-        <w:rPr>
-          <w:rFonts w:ascii="Calibri" w:hAnsi="Calibri"/>
-          <w:color w:val="1E293B"/>
-          <w:sz w:val="20"/>
-        </w:rPr>
-        <w:t>Click 'Save Produce'. The batch is immediately broadcast to the consumer marketplace with full origin transparency.</w:t>
-      </w:r>
-    </w:p>
-    <w:p>
-      <w:pPr>
-        <w:spacing w:before="160" w:after="60"/>
-        <w:jc w:val="center"/>
-      </w:pPr>
-      <w:r>
-        <w:drawing>
-          <wp:inline xmlns:a="http://schemas.openxmlformats.org/drawingml/2006/main" xmlns:pic="http://schemas.openxmlformats.org/drawingml/2006/picture">
-            <wp:extent cx="5486400" cy="3587262"/>
-            <wp:docPr id="7" name="Picture 7"/>
-            <wp:cNvGraphicFramePr>
-              <a:graphicFrameLocks noChangeAspect="1"/>
-            </wp:cNvGraphicFramePr>
-            <a:graphic>
-              <a:graphicData uri="http://schemas.openxmlformats.org/drawingml/2006/picture">
-                <pic:pic>
-                  <pic:nvPicPr>
-                    <pic:cNvPr id="0" name="farmer_02_products.png"/>
-                    <pic:cNvPicPr/>
-                  </pic:nvPicPr>
-                  <pic:blipFill>
-                    <a:blip r:embed="rId17"/>
-                    <a:stretch>
-                      <a:fillRect/>
-                    </a:stretch>
-                  </pic:blipFill>
-                  <pic:spPr>
-                    <a:xfrm>
-                      <a:off x="0" y="0"/>
-                      <a:ext cx="5486400" cy="3587262"/>
-                    </a:xfrm>
-                    <a:prstGeom prst="rect"/>
-                  </pic:spPr>
-                </pic:pic>
-              </a:graphicData>
-            </a:graphic>
-          </wp:inline>
-        </w:drawing>
-      </w:r>
-    </w:p>
-    <w:p>
-      <w:pPr>
-        <w:spacing w:before="0" w:after="240"/>
-        <w:jc w:val="center"/>
-      </w:pPr>
-      <w:r>
-        <w:rPr>
-          <w:rFonts w:ascii="Calibri" w:hAnsi="Calibri"/>
-          <w:i/>
-          <w:color w:val="64748B"/>
-          <w:sz w:val="17"/>
-        </w:rPr>
-        <w:t>Figure: Figure 3.2: Farmer Produce Catalog Management with AUD Unit Pricing and Origin Tracking</w:t>
-      </w:r>
-    </w:p>
-    <w:p>
-      <w:pPr>
-        <w:keepNext/>
-        <w:spacing w:before="280" w:after="80"/>
-      </w:pPr>
-      <w:r>
-        <w:rPr>
-          <w:rFonts w:ascii="Calibri" w:hAnsi="Calibri"/>
-          <w:b/>
-          <w:color w:val="2E7D32"/>
-          <w:sz w:val="26"/>
-        </w:rPr>
-        <w:t>3.3 Fulfilling &amp; Confirming Inbound Orders (farmer/orders.html)</w:t>
-      </w:r>
-    </w:p>
-    <w:p>
-      <w:pPr>
-        <w:spacing w:before="0" w:after="120" w:line="276" w:lineRule="auto"/>
-      </w:pPr>
-      <w:r>
-        <w:rPr>
-          <w:rFonts w:ascii="Calibri" w:hAnsi="Calibri"/>
-          <w:color w:val="1E293B"/>
-          <w:sz w:val="20"/>
-        </w:rPr>
-        <w:t>When a consumer places an order, it appears in the farmer's inbound order queue with status 'Order Placed'. The farmer must verify produce availability and pack the items for wholesale collection.</w:t>
-      </w:r>
-    </w:p>
-    <w:p>
-      <w:pPr>
-        <w:pStyle w:val="ListBullet"/>
-        <w:spacing w:before="0" w:after="60" w:line="276" w:lineRule="auto"/>
-      </w:pPr>
-      <w:r>
-        <w:rPr>
-          <w:rFonts w:ascii="Calibri" w:hAnsi="Calibri"/>
-          <w:b/>
-          <w:color w:val="1E293B"/>
-          <w:sz w:val="20"/>
-        </w:rPr>
-        <w:t xml:space="preserve">Step 1: </w:t>
-      </w:r>
-      <w:r>
-        <w:rPr>
-          <w:rFonts w:ascii="Calibri" w:hAnsi="Calibri"/>
-          <w:color w:val="1E293B"/>
-          <w:sz w:val="20"/>
-        </w:rPr>
-        <w:t>Review the customer's delivery destination, items requested, and order timestamp.</w:t>
-      </w:r>
-    </w:p>
-    <w:p>
-      <w:pPr>
-        <w:pStyle w:val="ListBullet"/>
-        <w:spacing w:before="0" w:after="60" w:line="276" w:lineRule="auto"/>
-      </w:pPr>
-      <w:r>
-        <w:rPr>
-          <w:rFonts w:ascii="Calibri" w:hAnsi="Calibri"/>
-          <w:b/>
-          <w:color w:val="1E293B"/>
-          <w:sz w:val="20"/>
-        </w:rPr>
-        <w:t xml:space="preserve">Step 2: </w:t>
-      </w:r>
-      <w:r>
-        <w:rPr>
-          <w:rFonts w:ascii="Calibri" w:hAnsi="Calibri"/>
-          <w:color w:val="1E293B"/>
-          <w:sz w:val="20"/>
-        </w:rPr>
-        <w:t>Physically pick and package the harvest batch adhering to Australian food safety standards.</w:t>
-      </w:r>
-    </w:p>
-    <w:p>
-      <w:pPr>
-        <w:pStyle w:val="ListBullet"/>
-        <w:spacing w:before="0" w:after="60" w:line="276" w:lineRule="auto"/>
-      </w:pPr>
-      <w:r>
-        <w:rPr>
-          <w:rFonts w:ascii="Calibri" w:hAnsi="Calibri"/>
-          <w:b/>
-          <w:color w:val="1E293B"/>
-          <w:sz w:val="20"/>
-        </w:rPr>
-        <w:t xml:space="preserve">Step 3: </w:t>
-      </w:r>
-      <w:r>
-        <w:rPr>
-          <w:rFonts w:ascii="Calibri" w:hAnsi="Calibri"/>
-          <w:color w:val="1E293B"/>
-          <w:sz w:val="20"/>
-        </w:rPr>
-        <w:t>Click 'Confirm Order'. The status transitions atomically to 'Farmer Confirmed'.</w:t>
-      </w:r>
-    </w:p>
-    <w:p>
-      <w:pPr>
-        <w:pStyle w:val="ListBullet"/>
-        <w:spacing w:before="0" w:after="60" w:line="276" w:lineRule="auto"/>
-      </w:pPr>
-      <w:r>
-        <w:rPr>
-          <w:rFonts w:ascii="Calibri" w:hAnsi="Calibri"/>
-          <w:b/>
-          <w:color w:val="1E293B"/>
-          <w:sz w:val="20"/>
-        </w:rPr>
-        <w:t xml:space="preserve">Step 4: </w:t>
-      </w:r>
-      <w:r>
-        <w:rPr>
-          <w:rFonts w:ascii="Calibri" w:hAnsi="Calibri"/>
-          <w:color w:val="1E293B"/>
-          <w:sz w:val="20"/>
-        </w:rPr>
-        <w:t>The order automatically transfers to the Wholesaler Quality Assurance queue for biosecurity certification.</w:t>
-      </w:r>
-    </w:p>
-    <w:p>
-      <w:pPr>
-        <w:spacing w:before="160" w:after="60"/>
-        <w:jc w:val="center"/>
-      </w:pPr>
-      <w:r>
-        <w:drawing>
-          <wp:inline xmlns:a="http://schemas.openxmlformats.org/drawingml/2006/main" xmlns:pic="http://schemas.openxmlformats.org/drawingml/2006/picture">
-            <wp:extent cx="5486400" cy="3587262"/>
-            <wp:docPr id="8" name="Picture 8"/>
-            <wp:cNvGraphicFramePr>
-              <a:graphicFrameLocks noChangeAspect="1"/>
-            </wp:cNvGraphicFramePr>
-            <a:graphic>
-              <a:graphicData uri="http://schemas.openxmlformats.org/drawingml/2006/picture">
-                <pic:pic>
-                  <pic:nvPicPr>
-                    <pic:cNvPr id="0" name="farmer_03_orders.png"/>
-                    <pic:cNvPicPr/>
-                  </pic:nvPicPr>
-                  <pic:blipFill>
-                    <a:blip r:embed="rId18"/>
-                    <a:stretch>
-                      <a:fillRect/>
-                    </a:stretch>
-                  </pic:blipFill>
-                  <pic:spPr>
-                    <a:xfrm>
-                      <a:off x="0" y="0"/>
-                      <a:ext cx="5486400" cy="3587262"/>
-                    </a:xfrm>
-                    <a:prstGeom prst="rect"/>
-                  </pic:spPr>
-                </pic:pic>
-              </a:graphicData>
-            </a:graphic>
-          </wp:inline>
-        </w:drawing>
-      </w:r>
-    </w:p>
-    <w:p>
-      <w:pPr>
-        <w:spacing w:before="0" w:after="240"/>
-        <w:jc w:val="center"/>
-      </w:pPr>
-      <w:r>
-        <w:rPr>
-          <w:rFonts w:ascii="Calibri" w:hAnsi="Calibri"/>
-          <w:i/>
-          <w:color w:val="64748B"/>
-          <w:sz w:val="17"/>
-        </w:rPr>
-        <w:t>Figure: Figure 3.3: Inbound Orders Queue and Batch Confirmation Workspace</w:t>
-      </w:r>
-    </w:p>
-    <w:p>
-      <w:pPr>
-        <w:keepNext/>
-        <w:spacing w:before="360" w:after="120"/>
-      </w:pPr>
-      <w:r>
-        <w:rPr>
-          <w:rFonts w:ascii="Calibri" w:hAnsi="Calibri"/>
-          <w:b/>
-          <w:color w:val="1B4D20"/>
-          <w:sz w:val="32"/>
-        </w:rPr>
-        <w:t>4. Wholesaler Accreditation &amp; Audit Manual (wholesaler/)</w:t>
-      </w:r>
-    </w:p>
-    <w:p>
-      <w:pPr>
-        <w:spacing w:before="0" w:after="120" w:line="276" w:lineRule="auto"/>
-      </w:pPr>
-      <w:r>
-        <w:rPr>
-          <w:rFonts w:ascii="Calibri" w:hAnsi="Calibri"/>
-          <w:color w:val="1E293B"/>
-          <w:sz w:val="20"/>
-        </w:rPr>
-        <w:t>Commercial wholesalers and distribution hubs act as critical quality checkpoints in the Australian agricultural supply chain. In accordance with Australian biosecurity frameworks, unvetted commercial distributors cannot certify food shipments without prior administrative accreditation.</w:t>
-      </w:r>
-    </w:p>
-    <w:p>
-      <w:pPr>
-        <w:spacing w:before="160" w:after="60"/>
-        <w:jc w:val="center"/>
-      </w:pPr>
-      <w:r>
-        <w:drawing>
-          <wp:inline xmlns:a="http://schemas.openxmlformats.org/drawingml/2006/main" xmlns:pic="http://schemas.openxmlformats.org/drawingml/2006/picture">
-            <wp:extent cx="5669280" cy="3644537"/>
-            <wp:docPr id="9" name="Picture 9"/>
-            <wp:cNvGraphicFramePr>
-              <a:graphicFrameLocks noChangeAspect="1"/>
-            </wp:cNvGraphicFramePr>
-            <a:graphic>
-              <a:graphicData uri="http://schemas.openxmlformats.org/drawingml/2006/picture">
-                <pic:pic>
-                  <pic:nvPicPr>
-                    <pic:cNvPr id="0" name="03_wholesaler_accreditation_flow.png"/>
-                    <pic:cNvPicPr/>
-                  </pic:nvPicPr>
-                  <pic:blipFill>
-                    <a:blip r:embed="rId19"/>
-                    <a:stretch>
-                      <a:fillRect/>
-                    </a:stretch>
-                  </pic:blipFill>
-                  <pic:spPr>
-                    <a:xfrm>
-                      <a:off x="0" y="0"/>
-                      <a:ext cx="5669280" cy="3644537"/>
-                    </a:xfrm>
-                    <a:prstGeom prst="rect"/>
-                  </pic:spPr>
-                </pic:pic>
-              </a:graphicData>
-            </a:graphic>
-          </wp:inline>
-        </w:drawing>
-      </w:r>
-    </w:p>
-    <w:p>
-      <w:pPr>
-        <w:spacing w:before="0" w:after="240"/>
-        <w:jc w:val="center"/>
-      </w:pPr>
-      <w:r>
-        <w:rPr>
-          <w:rFonts w:ascii="Calibri" w:hAnsi="Calibri"/>
-          <w:i/>
-          <w:color w:val="64748B"/>
-          <w:sz w:val="17"/>
-        </w:rPr>
-        <w:t>Figure: Figure 4.1: Wholesaler Accreditation &amp; Biosecurity Lifecycle Flowchart</w:t>
-      </w:r>
-    </w:p>
-    <w:p>
-      <w:pPr>
-        <w:keepNext/>
-        <w:spacing w:before="280" w:after="80"/>
-      </w:pPr>
-      <w:r>
-        <w:rPr>
-          <w:rFonts w:ascii="Calibri" w:hAnsi="Calibri"/>
-          <w:b/>
-          <w:color w:val="2E7D32"/>
-          <w:sz w:val="26"/>
-        </w:rPr>
-        <w:t>4.1 The Unaccredited Wholesaler Experience (wholesaler.pending@example.com)</w:t>
-      </w:r>
-    </w:p>
-    <w:p>
-      <w:pPr>
-        <w:spacing w:before="0" w:after="120" w:line="276" w:lineRule="auto"/>
-      </w:pPr>
-      <w:r>
-        <w:rPr>
-          <w:rFonts w:ascii="Calibri" w:hAnsi="Calibri"/>
-          <w:color w:val="1E293B"/>
-          <w:sz w:val="20"/>
-        </w:rPr>
-        <w:t>Upon registration, a wholesale distributor's status is defaulted to 'Pending Approval'. When logging in with pending credentials (e.g. Matilda Evans, Melbourne Wholesale Hub), the portal enforces strict regulatory lockouts:</w:t>
-      </w:r>
-    </w:p>
-    <w:p>
-      <w:pPr>
-        <w:pStyle w:val="ListBullet"/>
-        <w:spacing w:before="0" w:after="60" w:line="276" w:lineRule="auto"/>
-      </w:pPr>
-      <w:r>
-        <w:rPr>
-          <w:rFonts w:ascii="Calibri" w:hAnsi="Calibri"/>
-          <w:b/>
-          <w:color w:val="1E293B"/>
-          <w:sz w:val="20"/>
-        </w:rPr>
-        <w:t xml:space="preserve">• </w:t>
-      </w:r>
-      <w:r>
-        <w:rPr>
-          <w:rFonts w:ascii="Calibri" w:hAnsi="Calibri"/>
-          <w:color w:val="1E293B"/>
-          <w:sz w:val="20"/>
-        </w:rPr>
-        <w:t>Prominent amber warning banner displayed across all header views informing the user that their commercial license is under review.</w:t>
-      </w:r>
-    </w:p>
-    <w:p>
-      <w:pPr>
-        <w:pStyle w:val="ListBullet"/>
-        <w:spacing w:before="0" w:after="60" w:line="276" w:lineRule="auto"/>
-      </w:pPr>
-      <w:r>
-        <w:rPr>
-          <w:rFonts w:ascii="Calibri" w:hAnsi="Calibri"/>
-          <w:b/>
-          <w:color w:val="1E293B"/>
-          <w:sz w:val="20"/>
-        </w:rPr>
-        <w:t xml:space="preserve">• </w:t>
-      </w:r>
-      <w:r>
-        <w:rPr>
-          <w:rFonts w:ascii="Calibri" w:hAnsi="Calibri"/>
-          <w:color w:val="1E293B"/>
-          <w:sz w:val="20"/>
-        </w:rPr>
-        <w:t>Stock Verification controls on incoming farm orders are completely locked and disabled.</w:t>
-      </w:r>
-    </w:p>
-    <w:p>
-      <w:pPr>
-        <w:pStyle w:val="ListBullet"/>
-        <w:spacing w:before="0" w:after="60" w:line="276" w:lineRule="auto"/>
-      </w:pPr>
-      <w:r>
-        <w:rPr>
-          <w:rFonts w:ascii="Calibri" w:hAnsi="Calibri"/>
-          <w:b/>
-          <w:color w:val="1E293B"/>
-          <w:sz w:val="20"/>
-        </w:rPr>
-        <w:t xml:space="preserve">• </w:t>
-      </w:r>
-      <w:r>
-        <w:rPr>
-          <w:rFonts w:ascii="Calibri" w:hAnsi="Calibri"/>
-          <w:color w:val="1E293B"/>
-          <w:sz w:val="20"/>
-        </w:rPr>
-        <w:t>The wholesaler cannot verify batches, dispatch drivers, or modify order states until an Administrator grants formal approval.</w:t>
-      </w:r>
-    </w:p>
     <w:tbl>
       <w:tblPr>
         <w:tblW w:type="auto" w:w="0"/>
@@ -3244,7 +4088,7 @@
         <w:tc>
           <w:tcPr>
             <w:tcW w:type="dxa" w:w="9360"/>
-            <w:shd w:fill="FEF3C7"/>
+            <w:shd w:fill="F0FDF4"/>
             <w:tcMar>
               <w:top w:w="140" w:type="dxa"/>
               <w:bottom w:w="140" w:type="dxa"/>
@@ -3260,10 +4104,10 @@
               <w:rPr>
                 <w:rFonts w:ascii="Calibri" w:hAnsi="Calibri"/>
                 <w:b/>
-                <w:color w:val="B45309"/>
+                <w:color w:val="1B4D20"/>
                 <w:sz w:val="19"/>
               </w:rPr>
-              <w:t>■ REGULATORY BIOSECURITY RESTRICTION</w:t>
+              <w:t>■ QUICK TESTING SECURITY KEY</w:t>
               <w:br/>
             </w:r>
             <w:r>
@@ -3272,9 +4116,9 @@
                 <w:color w:val="1E293B"/>
                 <w:sz w:val="19"/>
               </w:rPr>
-              <w:t>WARNING: Account Pending Administrator Approval</w:t>
+              <w:t>Uniform Demo Password: password123</w:t>
               <w:br/>
-              <w:t>Your wholesale business credentials must be validated by an Administrator before you can audit stock and certify farm produce shipments. The 'Verify Stock' control remains locked until approval is granted.</w:t>
+              <w:t>All accounts use password123. Clicking any demo button on login.html auto-fills credentials and executes an immediate authenticated session.</w:t>
             </w:r>
           </w:p>
         </w:tc>
@@ -3284,116 +4128,6 @@
       <w:pPr>
         <w:spacing w:after="120"/>
       </w:pPr>
-    </w:p>
-    <w:p>
-      <w:pPr>
-        <w:spacing w:before="160" w:after="60"/>
-        <w:jc w:val="center"/>
-      </w:pPr>
-      <w:r>
-        <w:drawing>
-          <wp:inline xmlns:a="http://schemas.openxmlformats.org/drawingml/2006/main" xmlns:pic="http://schemas.openxmlformats.org/drawingml/2006/picture">
-            <wp:extent cx="5486400" cy="3587262"/>
-            <wp:docPr id="10" name="Picture 10"/>
-            <wp:cNvGraphicFramePr>
-              <a:graphicFrameLocks noChangeAspect="1"/>
-            </wp:cNvGraphicFramePr>
-            <a:graphic>
-              <a:graphicData uri="http://schemas.openxmlformats.org/drawingml/2006/picture">
-                <pic:pic>
-                  <pic:nvPicPr>
-                    <pic:cNvPr id="0" name="wholesaler_01_pending_dashboard.png"/>
-                    <pic:cNvPicPr/>
-                  </pic:nvPicPr>
-                  <pic:blipFill>
-                    <a:blip r:embed="rId20"/>
-                    <a:stretch>
-                      <a:fillRect/>
-                    </a:stretch>
-                  </pic:blipFill>
-                  <pic:spPr>
-                    <a:xfrm>
-                      <a:off x="0" y="0"/>
-                      <a:ext cx="5486400" cy="3587262"/>
-                    </a:xfrm>
-                    <a:prstGeom prst="rect"/>
-                  </pic:spPr>
-                </pic:pic>
-              </a:graphicData>
-            </a:graphic>
-          </wp:inline>
-        </w:drawing>
-      </w:r>
-    </w:p>
-    <w:p>
-      <w:pPr>
-        <w:spacing w:before="0" w:after="240"/>
-        <w:jc w:val="center"/>
-      </w:pPr>
-      <w:r>
-        <w:rPr>
-          <w:rFonts w:ascii="Calibri" w:hAnsi="Calibri"/>
-          <w:i/>
-          <w:color w:val="64748B"/>
-          <w:sz w:val="17"/>
-        </w:rPr>
-        <w:t>Figure: Figure 4.2: Pending Wholesaler Dashboard Displaying Regulatory Warning Banner (Matilda Evans)</w:t>
-      </w:r>
-    </w:p>
-    <w:p>
-      <w:pPr>
-        <w:spacing w:before="160" w:after="60"/>
-        <w:jc w:val="center"/>
-      </w:pPr>
-      <w:r>
-        <w:drawing>
-          <wp:inline xmlns:a="http://schemas.openxmlformats.org/drawingml/2006/main" xmlns:pic="http://schemas.openxmlformats.org/drawingml/2006/picture">
-            <wp:extent cx="5486400" cy="3587262"/>
-            <wp:docPr id="11" name="Picture 11"/>
-            <wp:cNvGraphicFramePr>
-              <a:graphicFrameLocks noChangeAspect="1"/>
-            </wp:cNvGraphicFramePr>
-            <a:graphic>
-              <a:graphicData uri="http://schemas.openxmlformats.org/drawingml/2006/picture">
-                <pic:pic>
-                  <pic:nvPicPr>
-                    <pic:cNvPr id="0" name="wholesaler_02_pending_orders.png"/>
-                    <pic:cNvPicPr/>
-                  </pic:nvPicPr>
-                  <pic:blipFill>
-                    <a:blip r:embed="rId21"/>
-                    <a:stretch>
-                      <a:fillRect/>
-                    </a:stretch>
-                  </pic:blipFill>
-                  <pic:spPr>
-                    <a:xfrm>
-                      <a:off x="0" y="0"/>
-                      <a:ext cx="5486400" cy="3587262"/>
-                    </a:xfrm>
-                    <a:prstGeom prst="rect"/>
-                  </pic:spPr>
-                </pic:pic>
-              </a:graphicData>
-            </a:graphic>
-          </wp:inline>
-        </w:drawing>
-      </w:r>
-    </w:p>
-    <w:p>
-      <w:pPr>
-        <w:spacing w:before="0" w:after="240"/>
-        <w:jc w:val="center"/>
-      </w:pPr>
-      <w:r>
-        <w:rPr>
-          <w:rFonts w:ascii="Calibri" w:hAnsi="Calibri"/>
-          <w:i/>
-          <w:color w:val="64748B"/>
-          <w:sz w:val="17"/>
-        </w:rPr>
-        <w:t>Figure: Figure 4.3: Wholesaler Quality Assurance Queue with Verification Actions Locked</w:t>
-      </w:r>
     </w:p>
     <w:p>
       <w:pPr>
@@ -3407,7 +4141,7 @@
           <w:color w:val="2E7D32"/>
           <w:sz w:val="26"/>
         </w:rPr>
-        <w:t>4.2 Accredited Wholesaler Operations (wholesaler@example.com)</w:t>
+        <w:t>3.2 Administrator Wholesaler Approvals Hub (admin/approvals.html)</w:t>
       </w:r>
     </w:p>
     <w:p>
@@ -3420,7 +4154,7 @@
           <w:color w:val="1E293B"/>
           <w:sz w:val="20"/>
         </w:rPr>
-        <w:t>Once verified and approved by an Administrator (e.g. Liam Wilson, Sydney Central Produce Markets), the wholesaler receives full operational privileges:</w:t>
+        <w:t>The Wholesaler Approvals Hub enforces regulatory compliance. Administrators inspect wholesaler credentials in three distinct operational states:</w:t>
       </w:r>
     </w:p>
     <w:p>
@@ -3435,7 +4169,7 @@
           <w:color w:val="1E293B"/>
           <w:sz w:val="20"/>
         </w:rPr>
-        <w:t xml:space="preserve">• </w:t>
+        <w:t xml:space="preserve">State 1: </w:t>
       </w:r>
       <w:r>
         <w:rPr>
@@ -3443,7 +4177,7 @@
           <w:color w:val="1E293B"/>
           <w:sz w:val="20"/>
         </w:rPr>
-        <w:t>The warning banner is replaced by an accredited badge confirming certified biosecurity status.</w:t>
+        <w:t>Pending Wholesalers: Unaccredited applications awaiting verification (amber status badge, 'Approve' and 'Reject &amp; Delete' actions).</w:t>
       </w:r>
     </w:p>
     <w:p>
@@ -3458,7 +4192,7 @@
           <w:color w:val="1E293B"/>
           <w:sz w:val="20"/>
         </w:rPr>
-        <w:t xml:space="preserve">• </w:t>
+        <w:t xml:space="preserve">State 2: </w:t>
       </w:r>
       <w:r>
         <w:rPr>
@@ -3466,7 +4200,7 @@
           <w:color w:val="1E293B"/>
           <w:sz w:val="20"/>
         </w:rPr>
-        <w:t>Orders in 'Farmer Confirmed' status display active 'Verify Stock' action buttons.</w:t>
+        <w:t>Accredited Active Wholesalers: Approved distributors with certified authority to audit farm batches (green status badge, 'Revoke' action).</w:t>
       </w:r>
     </w:p>
     <w:p>
@@ -3481,7 +4215,7 @@
           <w:color w:val="1E293B"/>
           <w:sz w:val="20"/>
         </w:rPr>
-        <w:t xml:space="preserve">• </w:t>
+        <w:t xml:space="preserve">State 3: </w:t>
       </w:r>
       <w:r>
         <w:rPr>
@@ -3489,30 +4223,7 @@
           <w:color w:val="1E293B"/>
           <w:sz w:val="20"/>
         </w:rPr>
-        <w:t>The auditor conducts physical and documentary checks: harvest date, cold storage temperature, weight tolerances, and packaging integrity.</w:t>
-      </w:r>
-    </w:p>
-    <w:p>
-      <w:pPr>
-        <w:pStyle w:val="ListBullet"/>
-        <w:spacing w:before="0" w:after="60" w:line="276" w:lineRule="auto"/>
-      </w:pPr>
-      <w:r>
-        <w:rPr>
-          <w:rFonts w:ascii="Calibri" w:hAnsi="Calibri"/>
-          <w:b/>
-          <w:color w:val="1E293B"/>
-          <w:sz w:val="20"/>
-        </w:rPr>
-        <w:t xml:space="preserve">• </w:t>
-      </w:r>
-      <w:r>
-        <w:rPr>
-          <w:rFonts w:ascii="Calibri" w:hAnsi="Calibri"/>
-          <w:color w:val="1E293B"/>
-          <w:sz w:val="20"/>
-        </w:rPr>
-        <w:t>Clicking 'Verify Stock' advances the order to 'Wholesaler Verified', assigning it to the Logistics Driver queue for dispatch.</w:t>
+        <w:t>Revocation &amp; Enforcement: Immediate removal of stock verification authority if non-compliant practices are detected.</w:t>
       </w:r>
     </w:p>
     <w:p>
@@ -3524,7 +4235,7 @@
         <w:drawing>
           <wp:inline xmlns:a="http://schemas.openxmlformats.org/drawingml/2006/main" xmlns:pic="http://schemas.openxmlformats.org/drawingml/2006/picture">
             <wp:extent cx="5486400" cy="3587262"/>
-            <wp:docPr id="12" name="Picture 12"/>
+            <wp:docPr id="35" name="Picture 35"/>
             <wp:cNvGraphicFramePr>
               <a:graphicFrameLocks noChangeAspect="1"/>
             </wp:cNvGraphicFramePr>
@@ -3532,62 +4243,7 @@
               <a:graphicData uri="http://schemas.openxmlformats.org/drawingml/2006/picture">
                 <pic:pic>
                   <pic:nvPicPr>
-                    <pic:cNvPr id="0" name="wholesaler_03_approved_dashboard.png"/>
-                    <pic:cNvPicPr/>
-                  </pic:nvPicPr>
-                  <pic:blipFill>
-                    <a:blip r:embed="rId22"/>
-                    <a:stretch>
-                      <a:fillRect/>
-                    </a:stretch>
-                  </pic:blipFill>
-                  <pic:spPr>
-                    <a:xfrm>
-                      <a:off x="0" y="0"/>
-                      <a:ext cx="5486400" cy="3587262"/>
-                    </a:xfrm>
-                    <a:prstGeom prst="rect"/>
-                  </pic:spPr>
-                </pic:pic>
-              </a:graphicData>
-            </a:graphic>
-          </wp:inline>
-        </w:drawing>
-      </w:r>
-    </w:p>
-    <w:p>
-      <w:pPr>
-        <w:spacing w:before="0" w:after="240"/>
-        <w:jc w:val="center"/>
-      </w:pPr>
-      <w:r>
-        <w:rPr>
-          <w:rFonts w:ascii="Calibri" w:hAnsi="Calibri"/>
-          <w:i/>
-          <w:color w:val="64748B"/>
-          <w:sz w:val="17"/>
-        </w:rPr>
-        <w:t>Figure: Figure 4.4: Accredited Wholesaler Certified Command Dashboard (Liam Wilson, Sydney NSW)</w:t>
-      </w:r>
-    </w:p>
-    <w:p>
-      <w:pPr>
-        <w:spacing w:before="160" w:after="60"/>
-        <w:jc w:val="center"/>
-      </w:pPr>
-      <w:r>
-        <w:drawing>
-          <wp:inline xmlns:a="http://schemas.openxmlformats.org/drawingml/2006/main" xmlns:pic="http://schemas.openxmlformats.org/drawingml/2006/picture">
-            <wp:extent cx="5486400" cy="3587262"/>
-            <wp:docPr id="13" name="Picture 13"/>
-            <wp:cNvGraphicFramePr>
-              <a:graphicFrameLocks noChangeAspect="1"/>
-            </wp:cNvGraphicFramePr>
-            <a:graphic>
-              <a:graphicData uri="http://schemas.openxmlformats.org/drawingml/2006/picture">
-                <pic:pic>
-                  <pic:nvPicPr>
-                    <pic:cNvPr id="0" name="wholesaler_04_approved_orders.png"/>
+                    <pic:cNvPr id="0" name="flow_12_admin_approvals_pending.png"/>
                     <pic:cNvPicPr/>
                   </pic:nvPicPr>
                   <pic:blipFill>
@@ -3622,63 +4278,7 @@
           <w:color w:val="64748B"/>
           <w:sz w:val="17"/>
         </w:rPr>
-        <w:t>Figure: Figure 4.5: Active Produce QA Verification &amp; Batch Certification Workspace</w:t>
-      </w:r>
-    </w:p>
-    <w:p>
-      <w:pPr>
-        <w:keepNext/>
-        <w:spacing w:before="360" w:after="120"/>
-      </w:pPr>
-      <w:r>
-        <w:rPr>
-          <w:rFonts w:ascii="Calibri" w:hAnsi="Calibri"/>
-          <w:b/>
-          <w:color w:val="1B4D20"/>
-          <w:sz w:val="32"/>
-        </w:rPr>
-        <w:t>5. Logistics &amp; Cold-Chain Driver Manual (driver/)</w:t>
-      </w:r>
-    </w:p>
-    <w:p>
-      <w:pPr>
-        <w:spacing w:before="0" w:after="120" w:line="276" w:lineRule="auto"/>
-      </w:pPr>
-      <w:r>
-        <w:rPr>
-          <w:rFonts w:ascii="Calibri" w:hAnsi="Calibri"/>
-          <w:color w:val="1E293B"/>
-          <w:sz w:val="20"/>
-        </w:rPr>
-        <w:t>Logistics drivers maintain physical custody and cold-chain integrity across regional highways and metropolitan delivery routes (e.g. Lucas Brown, Outback Cold Logistics). The Driver Portal operates seamlessly on mobile and desktop browsers to record transit checkpoints.</w:t>
-      </w:r>
-    </w:p>
-    <w:p>
-      <w:pPr>
-        <w:keepNext/>
-        <w:spacing w:before="280" w:after="80"/>
-      </w:pPr>
-      <w:r>
-        <w:rPr>
-          <w:rFonts w:ascii="Calibri" w:hAnsi="Calibri"/>
-          <w:b/>
-          <w:color w:val="2E7D32"/>
-          <w:sz w:val="26"/>
-        </w:rPr>
-        <w:t>5.1 Driver Fleet Dashboard (driver/dashboard.html)</w:t>
-      </w:r>
-    </w:p>
-    <w:p>
-      <w:pPr>
-        <w:spacing w:before="0" w:after="120" w:line="276" w:lineRule="auto"/>
-      </w:pPr>
-      <w:r>
-        <w:rPr>
-          <w:rFonts w:ascii="Calibri" w:hAnsi="Calibri"/>
-          <w:color w:val="1E293B"/>
-          <w:sz w:val="20"/>
-        </w:rPr>
-        <w:t>The driver dashboard summarizes active route assignments, shipments currently in transit, and total delivered packages for the shift.</w:t>
+        <w:t>Figure: Figure 3.1: Admin Wholesaler Approvals Hub — Pending Wholesaler Review Queue</w:t>
       </w:r>
     </w:p>
     <w:p>
@@ -3690,7 +4290,7 @@
         <w:drawing>
           <wp:inline xmlns:a="http://schemas.openxmlformats.org/drawingml/2006/main" xmlns:pic="http://schemas.openxmlformats.org/drawingml/2006/picture">
             <wp:extent cx="5486400" cy="3587262"/>
-            <wp:docPr id="14" name="Picture 14"/>
+            <wp:docPr id="36" name="Picture 36"/>
             <wp:cNvGraphicFramePr>
               <a:graphicFrameLocks noChangeAspect="1"/>
             </wp:cNvGraphicFramePr>
@@ -3698,270 +4298,7 @@
               <a:graphicData uri="http://schemas.openxmlformats.org/drawingml/2006/picture">
                 <pic:pic>
                   <pic:nvPicPr>
-                    <pic:cNvPr id="0" name="driver_01_dashboard.png"/>
-                    <pic:cNvPicPr/>
-                  </pic:nvPicPr>
-                  <pic:blipFill>
-                    <a:blip r:embed="rId24"/>
-                    <a:stretch>
-                      <a:fillRect/>
-                    </a:stretch>
-                  </pic:blipFill>
-                  <pic:spPr>
-                    <a:xfrm>
-                      <a:off x="0" y="0"/>
-                      <a:ext cx="5486400" cy="3587262"/>
-                    </a:xfrm>
-                    <a:prstGeom prst="rect"/>
-                  </pic:spPr>
-                </pic:pic>
-              </a:graphicData>
-            </a:graphic>
-          </wp:inline>
-        </w:drawing>
-      </w:r>
-    </w:p>
-    <w:p>
-      <w:pPr>
-        <w:spacing w:before="0" w:after="240"/>
-        <w:jc w:val="center"/>
-      </w:pPr>
-      <w:r>
-        <w:rPr>
-          <w:rFonts w:ascii="Calibri" w:hAnsi="Calibri"/>
-          <w:i/>
-          <w:color w:val="64748B"/>
-          <w:sz w:val="17"/>
-        </w:rPr>
-        <w:t>Figure: Figure 5.1: Logistics Driver Fleet Operations &amp; Milestone Telemetry (Lucas Brown)</w:t>
-      </w:r>
-    </w:p>
-    <w:p>
-      <w:pPr>
-        <w:keepNext/>
-        <w:spacing w:before="280" w:after="80"/>
-      </w:pPr>
-      <w:r>
-        <w:rPr>
-          <w:rFonts w:ascii="Calibri" w:hAnsi="Calibri"/>
-          <w:b/>
-          <w:color w:val="2E7D32"/>
-          <w:sz w:val="26"/>
-        </w:rPr>
-        <w:t>5.2 Executing Transit Milestone Checkpoints (driver/deliveries.html)</w:t>
-      </w:r>
-    </w:p>
-    <w:p>
-      <w:pPr>
-        <w:spacing w:before="0" w:after="120" w:line="276" w:lineRule="auto"/>
-      </w:pPr>
-      <w:r>
-        <w:rPr>
-          <w:rFonts w:ascii="Calibri" w:hAnsi="Calibri"/>
-          <w:color w:val="1E293B"/>
-          <w:sz w:val="20"/>
-        </w:rPr>
-        <w:t>The driver moves each verified shipment through three mandatory physical transit checkpoints:</w:t>
-      </w:r>
-    </w:p>
-    <w:p>
-      <w:pPr>
-        <w:pStyle w:val="ListBullet"/>
-        <w:spacing w:before="0" w:after="60" w:line="276" w:lineRule="auto"/>
-      </w:pPr>
-      <w:r>
-        <w:rPr>
-          <w:rFonts w:ascii="Calibri" w:hAnsi="Calibri"/>
-          <w:b/>
-          <w:color w:val="1E293B"/>
-          <w:sz w:val="20"/>
-        </w:rPr>
-        <w:t xml:space="preserve">1. </w:t>
-      </w:r>
-      <w:r>
-        <w:rPr>
-          <w:rFonts w:ascii="Calibri" w:hAnsi="Calibri"/>
-          <w:color w:val="1E293B"/>
-          <w:sz w:val="20"/>
-        </w:rPr>
-        <w:t>Checkpoint 1 - 'Mark as Picked Up': Clicked when the refrigerated vehicle collects certified produce from the regional farm or distribution hub. Sets status to 'Picked Up'.</w:t>
-      </w:r>
-    </w:p>
-    <w:p>
-      <w:pPr>
-        <w:pStyle w:val="ListBullet"/>
-        <w:spacing w:before="0" w:after="60" w:line="276" w:lineRule="auto"/>
-      </w:pPr>
-      <w:r>
-        <w:rPr>
-          <w:rFonts w:ascii="Calibri" w:hAnsi="Calibri"/>
-          <w:b/>
-          <w:color w:val="1E293B"/>
-          <w:sz w:val="20"/>
-        </w:rPr>
-        <w:t xml:space="preserve">2. </w:t>
-      </w:r>
-      <w:r>
-        <w:rPr>
-          <w:rFonts w:ascii="Calibri" w:hAnsi="Calibri"/>
-          <w:color w:val="1E293B"/>
-          <w:sz w:val="20"/>
-        </w:rPr>
-        <w:t>Checkpoint 2 - 'Mark as In Transit': Clicked upon departure from the central depot onto transit corridors. Sets status to 'In Transit'.</w:t>
-      </w:r>
-    </w:p>
-    <w:p>
-      <w:pPr>
-        <w:pStyle w:val="ListBullet"/>
-        <w:spacing w:before="0" w:after="60" w:line="276" w:lineRule="auto"/>
-      </w:pPr>
-      <w:r>
-        <w:rPr>
-          <w:rFonts w:ascii="Calibri" w:hAnsi="Calibri"/>
-          <w:b/>
-          <w:color w:val="1E293B"/>
-          <w:sz w:val="20"/>
-        </w:rPr>
-        <w:t xml:space="preserve">3. </w:t>
-      </w:r>
-      <w:r>
-        <w:rPr>
-          <w:rFonts w:ascii="Calibri" w:hAnsi="Calibri"/>
-          <w:color w:val="1E293B"/>
-          <w:sz w:val="20"/>
-        </w:rPr>
-        <w:t>Checkpoint 3 - 'Confirm Delivery': Clicked upon physical handover at the consumer's delivery address. Sets status to 'Delivered' and concludes custody tracking.</w:t>
-      </w:r>
-    </w:p>
-    <w:p>
-      <w:pPr>
-        <w:spacing w:before="160" w:after="60"/>
-        <w:jc w:val="center"/>
-      </w:pPr>
-      <w:r>
-        <w:drawing>
-          <wp:inline xmlns:a="http://schemas.openxmlformats.org/drawingml/2006/main" xmlns:pic="http://schemas.openxmlformats.org/drawingml/2006/picture">
-            <wp:extent cx="5486400" cy="3587262"/>
-            <wp:docPr id="15" name="Picture 15"/>
-            <wp:cNvGraphicFramePr>
-              <a:graphicFrameLocks noChangeAspect="1"/>
-            </wp:cNvGraphicFramePr>
-            <a:graphic>
-              <a:graphicData uri="http://schemas.openxmlformats.org/drawingml/2006/picture">
-                <pic:pic>
-                  <pic:nvPicPr>
-                    <pic:cNvPr id="0" name="driver_02_deliveries.png"/>
-                    <pic:cNvPicPr/>
-                  </pic:nvPicPr>
-                  <pic:blipFill>
-                    <a:blip r:embed="rId25"/>
-                    <a:stretch>
-                      <a:fillRect/>
-                    </a:stretch>
-                  </pic:blipFill>
-                  <pic:spPr>
-                    <a:xfrm>
-                      <a:off x="0" y="0"/>
-                      <a:ext cx="5486400" cy="3587262"/>
-                    </a:xfrm>
-                    <a:prstGeom prst="rect"/>
-                  </pic:spPr>
-                </pic:pic>
-              </a:graphicData>
-            </a:graphic>
-          </wp:inline>
-        </w:drawing>
-      </w:r>
-    </w:p>
-    <w:p>
-      <w:pPr>
-        <w:spacing w:before="0" w:after="240"/>
-        <w:jc w:val="center"/>
-      </w:pPr>
-      <w:r>
-        <w:rPr>
-          <w:rFonts w:ascii="Calibri" w:hAnsi="Calibri"/>
-          <w:i/>
-          <w:color w:val="64748B"/>
-          <w:sz w:val="17"/>
-        </w:rPr>
-        <w:t>Figure: Figure 5.2: Real-Time Transit Delivery Queue and Checkpoint Execution Controls</w:t>
-      </w:r>
-    </w:p>
-    <w:p>
-      <w:pPr>
-        <w:keepNext/>
-        <w:spacing w:before="360" w:after="120"/>
-      </w:pPr>
-      <w:r>
-        <w:rPr>
-          <w:rFonts w:ascii="Calibri" w:hAnsi="Calibri"/>
-          <w:b/>
-          <w:color w:val="1B4D20"/>
-          <w:sz w:val="32"/>
-        </w:rPr>
-        <w:t>6. Direct Consumer Marketplace &amp; Transparency Manual (customer/)</w:t>
-      </w:r>
-    </w:p>
-    <w:p>
-      <w:pPr>
-        <w:spacing w:before="0" w:after="120" w:line="276" w:lineRule="auto"/>
-      </w:pPr>
-      <w:r>
-        <w:rPr>
-          <w:rFonts w:ascii="Calibri" w:hAnsi="Calibri"/>
-          <w:color w:val="1E293B"/>
-          <w:sz w:val="20"/>
-        </w:rPr>
-        <w:t>AgriTrace enables Australian consumers to discover genuine regional harvests, purchase directly from family growers, inspect farm provenance, and track orders across 7 transparent milestones.</w:t>
-      </w:r>
-    </w:p>
-    <w:p>
-      <w:pPr>
-        <w:keepNext/>
-        <w:spacing w:before="280" w:after="80"/>
-      </w:pPr>
-      <w:r>
-        <w:rPr>
-          <w:rFonts w:ascii="Calibri" w:hAnsi="Calibri"/>
-          <w:b/>
-          <w:color w:val="2E7D32"/>
-          <w:sz w:val="26"/>
-        </w:rPr>
-        <w:t>6.1 Consumer Account Dashboard (customer/dashboard.html)</w:t>
-      </w:r>
-    </w:p>
-    <w:p>
-      <w:pPr>
-        <w:spacing w:before="0" w:after="120" w:line="276" w:lineRule="auto"/>
-      </w:pPr>
-      <w:r>
-        <w:rPr>
-          <w:rFonts w:ascii="Calibri" w:hAnsi="Calibri"/>
-          <w:color w:val="1E293B"/>
-          <w:sz w:val="20"/>
-        </w:rPr>
-        <w:t>The consumer dashboard provides quick access to recent orders, shopping cart status, and submitted farm feedback ratings.</w:t>
-      </w:r>
-    </w:p>
-    <w:p>
-      <w:pPr>
-        <w:spacing w:before="160" w:after="60"/>
-        <w:jc w:val="center"/>
-      </w:pPr>
-      <w:r>
-        <w:drawing>
-          <wp:inline xmlns:a="http://schemas.openxmlformats.org/drawingml/2006/main" xmlns:pic="http://schemas.openxmlformats.org/drawingml/2006/picture">
-            <wp:extent cx="5486400" cy="3587262"/>
-            <wp:docPr id="16" name="Picture 16"/>
-            <wp:cNvGraphicFramePr>
-              <a:graphicFrameLocks noChangeAspect="1"/>
-            </wp:cNvGraphicFramePr>
-            <a:graphic>
-              <a:graphicData uri="http://schemas.openxmlformats.org/drawingml/2006/picture">
-                <pic:pic>
-                  <pic:nvPicPr>
-                    <pic:cNvPr id="0" name="customer_01_dashboard.png"/>
+                    <pic:cNvPr id="0" name="flow_15_admin_wholesaler_approved.png"/>
                     <pic:cNvPicPr/>
                   </pic:nvPicPr>
                   <pic:blipFill>
@@ -3996,35 +4333,7 @@
           <w:color w:val="64748B"/>
           <w:sz w:val="17"/>
         </w:rPr>
-        <w:t>Figure: Figure 6.1: Consumer Account Dashboard &amp; Recent Order Summary (Chloe Taylor, Melbourne VIC)</w:t>
-      </w:r>
-    </w:p>
-    <w:p>
-      <w:pPr>
-        <w:keepNext/>
-        <w:spacing w:before="280" w:after="80"/>
-      </w:pPr>
-      <w:r>
-        <w:rPr>
-          <w:rFonts w:ascii="Calibri" w:hAnsi="Calibri"/>
-          <w:b/>
-          <w:color w:val="2E7D32"/>
-          <w:sz w:val="26"/>
-        </w:rPr>
-        <w:t>6.2 Discovering Regional Australian Produce (customer/products.html)</w:t>
-      </w:r>
-    </w:p>
-    <w:p>
-      <w:pPr>
-        <w:spacing w:before="0" w:after="120" w:line="276" w:lineRule="auto"/>
-      </w:pPr>
-      <w:r>
-        <w:rPr>
-          <w:rFonts w:ascii="Calibri" w:hAnsi="Calibri"/>
-          <w:color w:val="1E293B"/>
-          <w:sz w:val="20"/>
-        </w:rPr>
-        <w:t>Shoppers browse active listings filtered by category and origin. Every item clearly displays its regional Australian origin badge (e.g. 'Goulburn Valley VIC', 'Bowen QLD', 'Barossa Valley SA') alongside transparent AUD unit pricing.</w:t>
+        <w:t>Figure: Figure 3.2: Admin Wholesaler Approvals Hub — Wholesaler Approved &amp; Accredited Active</w:t>
       </w:r>
     </w:p>
     <w:p>
@@ -4036,7 +4345,7 @@
         <w:drawing>
           <wp:inline xmlns:a="http://schemas.openxmlformats.org/drawingml/2006/main" xmlns:pic="http://schemas.openxmlformats.org/drawingml/2006/picture">
             <wp:extent cx="5486400" cy="3587262"/>
-            <wp:docPr id="17" name="Picture 17"/>
+            <wp:docPr id="37" name="Picture 37"/>
             <wp:cNvGraphicFramePr>
               <a:graphicFrameLocks noChangeAspect="1"/>
             </wp:cNvGraphicFramePr>
@@ -4044,11 +4353,11 @@
               <a:graphicData uri="http://schemas.openxmlformats.org/drawingml/2006/picture">
                 <pic:pic>
                   <pic:nvPicPr>
-                    <pic:cNvPr id="0" name="customer_02_products.png"/>
+                    <pic:cNvPr id="0" name="flow_15_admin_wholesaler_approved.png"/>
                     <pic:cNvPicPr/>
                   </pic:nvPicPr>
                   <pic:blipFill>
-                    <a:blip r:embed="rId27"/>
+                    <a:blip r:embed="rId26"/>
                     <a:stretch>
                       <a:fillRect/>
                     </a:stretch>
@@ -4079,284 +4388,7 @@
           <w:color w:val="64748B"/>
           <w:sz w:val="17"/>
         </w:rPr>
-        <w:t>Figure: Figure 6.2: Fresh Australian Produce Marketplace with Origin Provenance &amp; Category Filters</w:t>
-      </w:r>
-    </w:p>
-    <w:p>
-      <w:pPr>
-        <w:keepNext/>
-        <w:spacing w:before="280" w:after="80"/>
-      </w:pPr>
-      <w:r>
-        <w:rPr>
-          <w:rFonts w:ascii="Calibri" w:hAnsi="Calibri"/>
-          <w:b/>
-          <w:color w:val="2E7D32"/>
-          <w:sz w:val="26"/>
-        </w:rPr>
-        <w:t>6.3 Shopping Cart &amp; Fair-Trade Checkout (customer/cart.html)</w:t>
-      </w:r>
-    </w:p>
-    <w:p>
-      <w:pPr>
-        <w:spacing w:before="0" w:after="120" w:line="276" w:lineRule="auto"/>
-      </w:pPr>
-      <w:r>
-        <w:rPr>
-          <w:rFonts w:ascii="Calibri" w:hAnsi="Calibri"/>
-          <w:color w:val="1E293B"/>
-          <w:sz w:val="20"/>
-        </w:rPr>
-        <w:t>Shoppers can review cart items, adjust quantities, verify farm sources, and execute fair-trade checkout. The system atomically reserves stock in Firestore and creates an order in 'Order Placed' status.</w:t>
-      </w:r>
-    </w:p>
-    <w:p>
-      <w:pPr>
-        <w:spacing w:before="160" w:after="60"/>
-        <w:jc w:val="center"/>
-      </w:pPr>
-      <w:r>
-        <w:drawing>
-          <wp:inline xmlns:a="http://schemas.openxmlformats.org/drawingml/2006/main" xmlns:pic="http://schemas.openxmlformats.org/drawingml/2006/picture">
-            <wp:extent cx="5486400" cy="3587262"/>
-            <wp:docPr id="18" name="Picture 18"/>
-            <wp:cNvGraphicFramePr>
-              <a:graphicFrameLocks noChangeAspect="1"/>
-            </wp:cNvGraphicFramePr>
-            <a:graphic>
-              <a:graphicData uri="http://schemas.openxmlformats.org/drawingml/2006/picture">
-                <pic:pic>
-                  <pic:nvPicPr>
-                    <pic:cNvPr id="0" name="customer_03_cart.png"/>
-                    <pic:cNvPicPr/>
-                  </pic:nvPicPr>
-                  <pic:blipFill>
-                    <a:blip r:embed="rId28"/>
-                    <a:stretch>
-                      <a:fillRect/>
-                    </a:stretch>
-                  </pic:blipFill>
-                  <pic:spPr>
-                    <a:xfrm>
-                      <a:off x="0" y="0"/>
-                      <a:ext cx="5486400" cy="3587262"/>
-                    </a:xfrm>
-                    <a:prstGeom prst="rect"/>
-                  </pic:spPr>
-                </pic:pic>
-              </a:graphicData>
-            </a:graphic>
-          </wp:inline>
-        </w:drawing>
-      </w:r>
-    </w:p>
-    <w:p>
-      <w:pPr>
-        <w:spacing w:before="0" w:after="240"/>
-        <w:jc w:val="center"/>
-      </w:pPr>
-      <w:r>
-        <w:rPr>
-          <w:rFonts w:ascii="Calibri" w:hAnsi="Calibri"/>
-          <w:i/>
-          <w:color w:val="64748B"/>
-          <w:sz w:val="17"/>
-        </w:rPr>
-        <w:t>Figure: Figure 6.3: Shopping Cart &amp; Fair-Trade Checkout Workspace with Itemized AUD Pricing</w:t>
-      </w:r>
-    </w:p>
-    <w:p>
-      <w:pPr>
-        <w:keepNext/>
-        <w:spacing w:before="280" w:after="80"/>
-      </w:pPr>
-      <w:r>
-        <w:rPr>
-          <w:rFonts w:ascii="Calibri" w:hAnsi="Calibri"/>
-          <w:b/>
-          <w:color w:val="2E7D32"/>
-          <w:sz w:val="26"/>
-        </w:rPr>
-        <w:t>6.4 7-Stage Live Order Provenance Tracking (customer/orders.html)</w:t>
-      </w:r>
-    </w:p>
-    <w:p>
-      <w:pPr>
-        <w:spacing w:before="0" w:after="120" w:line="276" w:lineRule="auto"/>
-      </w:pPr>
-      <w:r>
-        <w:rPr>
-          <w:rFonts w:ascii="Calibri" w:hAnsi="Calibri"/>
-          <w:color w:val="1E293B"/>
-          <w:sz w:val="20"/>
-        </w:rPr>
-        <w:t>On 'My Orders', the customer can observe real-time progress indicators highlighting each completed stage in the custody pipeline: Order Placed -&gt; Farmer Confirmed -&gt; Wholesaler Verified -&gt; Picked Up -&gt; In Transit -&gt; Out for Delivery -&gt; Delivered.</w:t>
-      </w:r>
-    </w:p>
-    <w:p>
-      <w:pPr>
-        <w:spacing w:before="160" w:after="60"/>
-        <w:jc w:val="center"/>
-      </w:pPr>
-      <w:r>
-        <w:drawing>
-          <wp:inline xmlns:a="http://schemas.openxmlformats.org/drawingml/2006/main" xmlns:pic="http://schemas.openxmlformats.org/drawingml/2006/picture">
-            <wp:extent cx="5486400" cy="3587262"/>
-            <wp:docPr id="19" name="Picture 19"/>
-            <wp:cNvGraphicFramePr>
-              <a:graphicFrameLocks noChangeAspect="1"/>
-            </wp:cNvGraphicFramePr>
-            <a:graphic>
-              <a:graphicData uri="http://schemas.openxmlformats.org/drawingml/2006/picture">
-                <pic:pic>
-                  <pic:nvPicPr>
-                    <pic:cNvPr id="0" name="customer_04_orders.png"/>
-                    <pic:cNvPicPr/>
-                  </pic:nvPicPr>
-                  <pic:blipFill>
-                    <a:blip r:embed="rId29"/>
-                    <a:stretch>
-                      <a:fillRect/>
-                    </a:stretch>
-                  </pic:blipFill>
-                  <pic:spPr>
-                    <a:xfrm>
-                      <a:off x="0" y="0"/>
-                      <a:ext cx="5486400" cy="3587262"/>
-                    </a:xfrm>
-                    <a:prstGeom prst="rect"/>
-                  </pic:spPr>
-                </pic:pic>
-              </a:graphicData>
-            </a:graphic>
-          </wp:inline>
-        </w:drawing>
-      </w:r>
-    </w:p>
-    <w:p>
-      <w:pPr>
-        <w:spacing w:before="0" w:after="240"/>
-        <w:jc w:val="center"/>
-      </w:pPr>
-      <w:r>
-        <w:rPr>
-          <w:rFonts w:ascii="Calibri" w:hAnsi="Calibri"/>
-          <w:i/>
-          <w:color w:val="64748B"/>
-          <w:sz w:val="17"/>
-        </w:rPr>
-        <w:t>Figure: Figure 6.4: 7-Stage Live Order Provenance and Real-Time Custody Tracker</w:t>
-      </w:r>
-    </w:p>
-    <w:p>
-      <w:pPr>
-        <w:keepNext/>
-        <w:spacing w:before="280" w:after="80"/>
-      </w:pPr>
-      <w:r>
-        <w:rPr>
-          <w:rFonts w:ascii="Calibri" w:hAnsi="Calibri"/>
-          <w:b/>
-          <w:color w:val="2E7D32"/>
-          <w:sz w:val="26"/>
-        </w:rPr>
-        <w:t>6.5 Submitting Farmer Quality Feedback (customer/feedback.html)</w:t>
-      </w:r>
-    </w:p>
-    <w:p>
-      <w:pPr>
-        <w:spacing w:before="0" w:after="120" w:line="276" w:lineRule="auto"/>
-      </w:pPr>
-      <w:r>
-        <w:rPr>
-          <w:rFonts w:ascii="Calibri" w:hAnsi="Calibri"/>
-          <w:color w:val="1E293B"/>
-          <w:sz w:val="20"/>
-        </w:rPr>
-        <w:t>Once an order is marked 'Delivered', the customer can submit an authentic 1-to-5 star quality rating and review comment. Ratings link directly to the grower's profile, fostering long-term consumer trust.</w:t>
-      </w:r>
-    </w:p>
-    <w:p>
-      <w:pPr>
-        <w:spacing w:before="160" w:after="60"/>
-        <w:jc w:val="center"/>
-      </w:pPr>
-      <w:r>
-        <w:drawing>
-          <wp:inline xmlns:a="http://schemas.openxmlformats.org/drawingml/2006/main" xmlns:pic="http://schemas.openxmlformats.org/drawingml/2006/picture">
-            <wp:extent cx="5486400" cy="3587262"/>
-            <wp:docPr id="20" name="Picture 20"/>
-            <wp:cNvGraphicFramePr>
-              <a:graphicFrameLocks noChangeAspect="1"/>
-            </wp:cNvGraphicFramePr>
-            <a:graphic>
-              <a:graphicData uri="http://schemas.openxmlformats.org/drawingml/2006/picture">
-                <pic:pic>
-                  <pic:nvPicPr>
-                    <pic:cNvPr id="0" name="customer_05_feedback.png"/>
-                    <pic:cNvPicPr/>
-                  </pic:nvPicPr>
-                  <pic:blipFill>
-                    <a:blip r:embed="rId30"/>
-                    <a:stretch>
-                      <a:fillRect/>
-                    </a:stretch>
-                  </pic:blipFill>
-                  <pic:spPr>
-                    <a:xfrm>
-                      <a:off x="0" y="0"/>
-                      <a:ext cx="5486400" cy="3587262"/>
-                    </a:xfrm>
-                    <a:prstGeom prst="rect"/>
-                  </pic:spPr>
-                </pic:pic>
-              </a:graphicData>
-            </a:graphic>
-          </wp:inline>
-        </w:drawing>
-      </w:r>
-    </w:p>
-    <w:p>
-      <w:pPr>
-        <w:spacing w:before="0" w:after="240"/>
-        <w:jc w:val="center"/>
-      </w:pPr>
-      <w:r>
-        <w:rPr>
-          <w:rFonts w:ascii="Calibri" w:hAnsi="Calibri"/>
-          <w:i/>
-          <w:color w:val="64748B"/>
-          <w:sz w:val="17"/>
-        </w:rPr>
-        <w:t>Figure: Figure 6.5: Fair-Trade Farmer Quality Rating &amp; Review Submission Form</w:t>
-      </w:r>
-    </w:p>
-    <w:p>
-      <w:pPr>
-        <w:keepNext/>
-        <w:spacing w:before="360" w:after="120"/>
-      </w:pPr>
-      <w:r>
-        <w:rPr>
-          <w:rFonts w:ascii="Calibri" w:hAnsi="Calibri"/>
-          <w:b/>
-          <w:color w:val="1B4D20"/>
-          <w:sz w:val="32"/>
-        </w:rPr>
-        <w:t>7. System Administrator Governance &amp; Compliance Manual (admin/)</w:t>
-      </w:r>
-    </w:p>
-    <w:p>
-      <w:pPr>
-        <w:spacing w:before="0" w:after="120" w:line="276" w:lineRule="auto"/>
-      </w:pPr>
-      <w:r>
-        <w:rPr>
-          <w:rFonts w:ascii="Calibri" w:hAnsi="Calibri"/>
-          <w:color w:val="1E293B"/>
-          <w:sz w:val="20"/>
-        </w:rPr>
-        <w:t>The Administrator Portal serves as the central command bridge for platform governance, regulatory biosecurity accreditation, dispute resolution, user registry oversight, and financial feasibility auditing.</w:t>
+        <w:t>Figure: Figure 3.3: Admin Wholesaler Approvals Hub — Regulatory Revocation &amp; Governance Controls</w:t>
       </w:r>
     </w:p>
     <w:p>
@@ -4368,7 +4400,7 @@
         <w:drawing>
           <wp:inline xmlns:a="http://schemas.openxmlformats.org/drawingml/2006/main" xmlns:pic="http://schemas.openxmlformats.org/drawingml/2006/picture">
             <wp:extent cx="5669280" cy="3644537"/>
-            <wp:docPr id="21" name="Picture 21"/>
+            <wp:docPr id="38" name="Picture 38"/>
             <wp:cNvGraphicFramePr>
               <a:graphicFrameLocks noChangeAspect="1"/>
             </wp:cNvGraphicFramePr>
@@ -4380,7 +4412,7 @@
                     <pic:cNvPicPr/>
                   </pic:nvPicPr>
                   <pic:blipFill>
-                    <a:blip r:embed="rId31"/>
+                    <a:blip r:embed="rId41"/>
                     <a:stretch>
                       <a:fillRect/>
                     </a:stretch>
@@ -4411,666 +4443,7 @@
           <w:color w:val="64748B"/>
           <w:sz w:val="17"/>
         </w:rPr>
-        <w:t>Figure: Figure 7.1: Multi-Module Administrative Governance Architecture</w:t>
-      </w:r>
-    </w:p>
-    <w:p>
-      <w:pPr>
-        <w:keepNext/>
-        <w:spacing w:before="280" w:after="80"/>
-      </w:pPr>
-      <w:r>
-        <w:rPr>
-          <w:rFonts w:ascii="Calibri" w:hAnsi="Calibri"/>
-          <w:b/>
-          <w:color w:val="2E7D32"/>
-          <w:sz w:val="26"/>
-        </w:rPr>
-        <w:t>7.1 Admin Command Center &amp; Live Telemetry (admin/dashboard.html)</w:t>
-      </w:r>
-    </w:p>
-    <w:p>
-      <w:pPr>
-        <w:spacing w:before="0" w:after="120" w:line="276" w:lineRule="auto"/>
-      </w:pPr>
-      <w:r>
-        <w:rPr>
-          <w:rFonts w:ascii="Calibri" w:hAnsi="Calibri"/>
-          <w:color w:val="1E293B"/>
-          <w:sz w:val="20"/>
-        </w:rPr>
-        <w:t>The main dashboard provides high-level platform telemetry: total registered stakeholders, pending wholesaler accreditation queues, active produce listings, and cumulative gross merchandise volume (GMV) in AUD.</w:t>
-      </w:r>
-    </w:p>
-    <w:p>
-      <w:pPr>
-        <w:spacing w:before="160" w:after="60"/>
-        <w:jc w:val="center"/>
-      </w:pPr>
-      <w:r>
-        <w:drawing>
-          <wp:inline xmlns:a="http://schemas.openxmlformats.org/drawingml/2006/main" xmlns:pic="http://schemas.openxmlformats.org/drawingml/2006/picture">
-            <wp:extent cx="5486400" cy="3587262"/>
-            <wp:docPr id="22" name="Picture 22"/>
-            <wp:cNvGraphicFramePr>
-              <a:graphicFrameLocks noChangeAspect="1"/>
-            </wp:cNvGraphicFramePr>
-            <a:graphic>
-              <a:graphicData uri="http://schemas.openxmlformats.org/drawingml/2006/picture">
-                <pic:pic>
-                  <pic:nvPicPr>
-                    <pic:cNvPr id="0" name="admin_01_dashboard.png"/>
-                    <pic:cNvPicPr/>
-                  </pic:nvPicPr>
-                  <pic:blipFill>
-                    <a:blip r:embed="rId32"/>
-                    <a:stretch>
-                      <a:fillRect/>
-                    </a:stretch>
-                  </pic:blipFill>
-                  <pic:spPr>
-                    <a:xfrm>
-                      <a:off x="0" y="0"/>
-                      <a:ext cx="5486400" cy="3587262"/>
-                    </a:xfrm>
-                    <a:prstGeom prst="rect"/>
-                  </pic:spPr>
-                </pic:pic>
-              </a:graphicData>
-            </a:graphic>
-          </wp:inline>
-        </w:drawing>
-      </w:r>
-    </w:p>
-    <w:p>
-      <w:pPr>
-        <w:spacing w:before="0" w:after="240"/>
-        <w:jc w:val="center"/>
-      </w:pPr>
-      <w:r>
-        <w:rPr>
-          <w:rFonts w:ascii="Calibri" w:hAnsi="Calibri"/>
-          <w:i/>
-          <w:color w:val="64748B"/>
-          <w:sz w:val="17"/>
-        </w:rPr>
-        <w:t>Figure: Figure 7.2: Central Administration Command Center &amp; Platform Metrics Telemetry</w:t>
-      </w:r>
-    </w:p>
-    <w:p>
-      <w:pPr>
-        <w:keepNext/>
-        <w:spacing w:before="280" w:after="80"/>
-      </w:pPr>
-      <w:r>
-        <w:rPr>
-          <w:rFonts w:ascii="Calibri" w:hAnsi="Calibri"/>
-          <w:b/>
-          <w:color w:val="2E7D32"/>
-          <w:sz w:val="26"/>
-        </w:rPr>
-        <w:t>7.2 Wholesaler Accreditation &amp; Approvals Hub (admin/approvals.html)</w:t>
-      </w:r>
-    </w:p>
-    <w:p>
-      <w:pPr>
-        <w:spacing w:before="0" w:after="120" w:line="276" w:lineRule="auto"/>
-      </w:pPr>
-      <w:r>
-        <w:rPr>
-          <w:rFonts w:ascii="Calibri" w:hAnsi="Calibri"/>
-          <w:color w:val="1E293B"/>
-          <w:sz w:val="20"/>
-        </w:rPr>
-        <w:t>This critical governance module displays all registered wholesale entities awaiting biosecurity vetting. The Administrator can inspect legal trading names, business premises, and phone records before executing 1-click approvals or revoking credentials if standards are breached.</w:t>
-      </w:r>
-    </w:p>
-    <w:p>
-      <w:pPr>
-        <w:pStyle w:val="ListBullet"/>
-        <w:spacing w:before="0" w:after="60" w:line="276" w:lineRule="auto"/>
-      </w:pPr>
-      <w:r>
-        <w:rPr>
-          <w:rFonts w:ascii="Calibri" w:hAnsi="Calibri"/>
-          <w:b/>
-          <w:color w:val="1E293B"/>
-          <w:sz w:val="20"/>
-        </w:rPr>
-        <w:t xml:space="preserve">• </w:t>
-      </w:r>
-      <w:r>
-        <w:rPr>
-          <w:rFonts w:ascii="Calibri" w:hAnsi="Calibri"/>
-          <w:color w:val="1E293B"/>
-          <w:sz w:val="20"/>
-        </w:rPr>
-        <w:t>Review Pending Applications: Displays unaccredited wholesalers with amber badges.</w:t>
-      </w:r>
-    </w:p>
-    <w:p>
-      <w:pPr>
-        <w:pStyle w:val="ListBullet"/>
-        <w:spacing w:before="0" w:after="60" w:line="276" w:lineRule="auto"/>
-      </w:pPr>
-      <w:r>
-        <w:rPr>
-          <w:rFonts w:ascii="Calibri" w:hAnsi="Calibri"/>
-          <w:b/>
-          <w:color w:val="1E293B"/>
-          <w:sz w:val="20"/>
-        </w:rPr>
-        <w:t xml:space="preserve">• </w:t>
-      </w:r>
-      <w:r>
-        <w:rPr>
-          <w:rFonts w:ascii="Calibri" w:hAnsi="Calibri"/>
-          <w:color w:val="1E293B"/>
-          <w:sz w:val="20"/>
-        </w:rPr>
-        <w:t>Click 'Approve Wholesaler': Instantly grants full stock verification permissions in Firestore.</w:t>
-      </w:r>
-    </w:p>
-    <w:p>
-      <w:pPr>
-        <w:pStyle w:val="ListBullet"/>
-        <w:spacing w:before="0" w:after="60" w:line="276" w:lineRule="auto"/>
-      </w:pPr>
-      <w:r>
-        <w:rPr>
-          <w:rFonts w:ascii="Calibri" w:hAnsi="Calibri"/>
-          <w:b/>
-          <w:color w:val="1E293B"/>
-          <w:sz w:val="20"/>
-        </w:rPr>
-        <w:t xml:space="preserve">• </w:t>
-      </w:r>
-      <w:r>
-        <w:rPr>
-          <w:rFonts w:ascii="Calibri" w:hAnsi="Calibri"/>
-          <w:color w:val="1E293B"/>
-          <w:sz w:val="20"/>
-        </w:rPr>
-        <w:t>Revoke Accreditation: If compliance issues arise, clicking 'Revoke' immediately locks the wholesaler's verification capabilities.</w:t>
-      </w:r>
-    </w:p>
-    <w:p>
-      <w:pPr>
-        <w:spacing w:before="160" w:after="60"/>
-        <w:jc w:val="center"/>
-      </w:pPr>
-      <w:r>
-        <w:drawing>
-          <wp:inline xmlns:a="http://schemas.openxmlformats.org/drawingml/2006/main" xmlns:pic="http://schemas.openxmlformats.org/drawingml/2006/picture">
-            <wp:extent cx="5486400" cy="3587262"/>
-            <wp:docPr id="23" name="Picture 23"/>
-            <wp:cNvGraphicFramePr>
-              <a:graphicFrameLocks noChangeAspect="1"/>
-            </wp:cNvGraphicFramePr>
-            <a:graphic>
-              <a:graphicData uri="http://schemas.openxmlformats.org/drawingml/2006/picture">
-                <pic:pic>
-                  <pic:nvPicPr>
-                    <pic:cNvPr id="0" name="admin_02_approvals.png"/>
-                    <pic:cNvPicPr/>
-                  </pic:nvPicPr>
-                  <pic:blipFill>
-                    <a:blip r:embed="rId33"/>
-                    <a:stretch>
-                      <a:fillRect/>
-                    </a:stretch>
-                  </pic:blipFill>
-                  <pic:spPr>
-                    <a:xfrm>
-                      <a:off x="0" y="0"/>
-                      <a:ext cx="5486400" cy="3587262"/>
-                    </a:xfrm>
-                    <a:prstGeom prst="rect"/>
-                  </pic:spPr>
-                </pic:pic>
-              </a:graphicData>
-            </a:graphic>
-          </wp:inline>
-        </w:drawing>
-      </w:r>
-    </w:p>
-    <w:p>
-      <w:pPr>
-        <w:spacing w:before="0" w:after="240"/>
-        <w:jc w:val="center"/>
-      </w:pPr>
-      <w:r>
-        <w:rPr>
-          <w:rFonts w:ascii="Calibri" w:hAnsi="Calibri"/>
-          <w:i/>
-          <w:color w:val="64748B"/>
-          <w:sz w:val="17"/>
-        </w:rPr>
-        <w:t>Figure: Figure 7.3: Wholesaler Accreditation &amp; Regulatory Approvals Management Hub</w:t>
-      </w:r>
-    </w:p>
-    <w:p>
-      <w:pPr>
-        <w:keepNext/>
-        <w:spacing w:before="280" w:after="80"/>
-      </w:pPr>
-      <w:r>
-        <w:rPr>
-          <w:rFonts w:ascii="Calibri" w:hAnsi="Calibri"/>
-          <w:b/>
-          <w:color w:val="2E7D32"/>
-          <w:sz w:val="26"/>
-        </w:rPr>
-        <w:t>7.3 Master Stakeholder User Directory (admin/users.html)</w:t>
-      </w:r>
-    </w:p>
-    <w:p>
-      <w:pPr>
-        <w:spacing w:before="0" w:after="120" w:line="276" w:lineRule="auto"/>
-      </w:pPr>
-      <w:r>
-        <w:rPr>
-          <w:rFonts w:ascii="Calibri" w:hAnsi="Calibri"/>
-          <w:color w:val="1E293B"/>
-          <w:sz w:val="20"/>
-        </w:rPr>
-        <w:t>The User Management console lists every stakeholder profile across all roles (Farmer, Wholesaler, Driver, Customer, Admin). Administrators can filter by role, audit contact phone numbers, and verify registration timestamps.</w:t>
-      </w:r>
-    </w:p>
-    <w:p>
-      <w:pPr>
-        <w:spacing w:before="160" w:after="60"/>
-        <w:jc w:val="center"/>
-      </w:pPr>
-      <w:r>
-        <w:drawing>
-          <wp:inline xmlns:a="http://schemas.openxmlformats.org/drawingml/2006/main" xmlns:pic="http://schemas.openxmlformats.org/drawingml/2006/picture">
-            <wp:extent cx="5486400" cy="3587262"/>
-            <wp:docPr id="24" name="Picture 24"/>
-            <wp:cNvGraphicFramePr>
-              <a:graphicFrameLocks noChangeAspect="1"/>
-            </wp:cNvGraphicFramePr>
-            <a:graphic>
-              <a:graphicData uri="http://schemas.openxmlformats.org/drawingml/2006/picture">
-                <pic:pic>
-                  <pic:nvPicPr>
-                    <pic:cNvPr id="0" name="admin_03_users.png"/>
-                    <pic:cNvPicPr/>
-                  </pic:nvPicPr>
-                  <pic:blipFill>
-                    <a:blip r:embed="rId34"/>
-                    <a:stretch>
-                      <a:fillRect/>
-                    </a:stretch>
-                  </pic:blipFill>
-                  <pic:spPr>
-                    <a:xfrm>
-                      <a:off x="0" y="0"/>
-                      <a:ext cx="5486400" cy="3587262"/>
-                    </a:xfrm>
-                    <a:prstGeom prst="rect"/>
-                  </pic:spPr>
-                </pic:pic>
-              </a:graphicData>
-            </a:graphic>
-          </wp:inline>
-        </w:drawing>
-      </w:r>
-    </w:p>
-    <w:p>
-      <w:pPr>
-        <w:spacing w:before="0" w:after="240"/>
-        <w:jc w:val="center"/>
-      </w:pPr>
-      <w:r>
-        <w:rPr>
-          <w:rFonts w:ascii="Calibri" w:hAnsi="Calibri"/>
-          <w:i/>
-          <w:color w:val="64748B"/>
-          <w:sz w:val="17"/>
-        </w:rPr>
-        <w:t>Figure: Figure 7.4: Master Stakeholder Registry and Role Management Workspace</w:t>
-      </w:r>
-    </w:p>
-    <w:p>
-      <w:pPr>
-        <w:keepNext/>
-        <w:spacing w:before="280" w:after="80"/>
-      </w:pPr>
-      <w:r>
-        <w:rPr>
-          <w:rFonts w:ascii="Calibri" w:hAnsi="Calibri"/>
-          <w:b/>
-          <w:color w:val="2E7D32"/>
-          <w:sz w:val="26"/>
-        </w:rPr>
-        <w:t>7.4 Global Product Catalog &amp; Biosecurity Audit (admin/products.html)</w:t>
-      </w:r>
-    </w:p>
-    <w:p>
-      <w:pPr>
-        <w:spacing w:before="0" w:after="120" w:line="276" w:lineRule="auto"/>
-      </w:pPr>
-      <w:r>
-        <w:rPr>
-          <w:rFonts w:ascii="Calibri" w:hAnsi="Calibri"/>
-          <w:color w:val="1E293B"/>
-          <w:sz w:val="20"/>
-        </w:rPr>
-        <w:t>Administrators can audit all produce batches listed on the platform to prevent fraudulent origin claims, monitor fair AUD farm-gate pricing, and verify that produce origins comply with Australian state biosecurity regulations.</w:t>
-      </w:r>
-    </w:p>
-    <w:p>
-      <w:pPr>
-        <w:spacing w:before="160" w:after="60"/>
-        <w:jc w:val="center"/>
-      </w:pPr>
-      <w:r>
-        <w:drawing>
-          <wp:inline xmlns:a="http://schemas.openxmlformats.org/drawingml/2006/main" xmlns:pic="http://schemas.openxmlformats.org/drawingml/2006/picture">
-            <wp:extent cx="5486400" cy="3587262"/>
-            <wp:docPr id="25" name="Picture 25"/>
-            <wp:cNvGraphicFramePr>
-              <a:graphicFrameLocks noChangeAspect="1"/>
-            </wp:cNvGraphicFramePr>
-            <a:graphic>
-              <a:graphicData uri="http://schemas.openxmlformats.org/drawingml/2006/picture">
-                <pic:pic>
-                  <pic:nvPicPr>
-                    <pic:cNvPr id="0" name="admin_04_products.png"/>
-                    <pic:cNvPicPr/>
-                  </pic:nvPicPr>
-                  <pic:blipFill>
-                    <a:blip r:embed="rId35"/>
-                    <a:stretch>
-                      <a:fillRect/>
-                    </a:stretch>
-                  </pic:blipFill>
-                  <pic:spPr>
-                    <a:xfrm>
-                      <a:off x="0" y="0"/>
-                      <a:ext cx="5486400" cy="3587262"/>
-                    </a:xfrm>
-                    <a:prstGeom prst="rect"/>
-                  </pic:spPr>
-                </pic:pic>
-              </a:graphicData>
-            </a:graphic>
-          </wp:inline>
-        </w:drawing>
-      </w:r>
-    </w:p>
-    <w:p>
-      <w:pPr>
-        <w:spacing w:before="0" w:after="240"/>
-        <w:jc w:val="center"/>
-      </w:pPr>
-      <w:r>
-        <w:rPr>
-          <w:rFonts w:ascii="Calibri" w:hAnsi="Calibri"/>
-          <w:i/>
-          <w:color w:val="64748B"/>
-          <w:sz w:val="17"/>
-        </w:rPr>
-        <w:t>Figure: Figure 7.5: Global Produce Catalog Audit &amp; Biosecurity Verification Ledger</w:t>
-      </w:r>
-    </w:p>
-    <w:p>
-      <w:pPr>
-        <w:keepNext/>
-        <w:spacing w:before="280" w:after="80"/>
-      </w:pPr>
-      <w:r>
-        <w:rPr>
-          <w:rFonts w:ascii="Calibri" w:hAnsi="Calibri"/>
-          <w:b/>
-          <w:color w:val="2E7D32"/>
-          <w:sz w:val="26"/>
-        </w:rPr>
-        <w:t>7.5 Master Supply Chain Order Audit Ledger (admin/orders.html)</w:t>
-      </w:r>
-    </w:p>
-    <w:p>
-      <w:pPr>
-        <w:spacing w:before="0" w:after="120" w:line="276" w:lineRule="auto"/>
-      </w:pPr>
-      <w:r>
-        <w:rPr>
-          <w:rFonts w:ascii="Calibri" w:hAnsi="Calibri"/>
-          <w:color w:val="1E293B"/>
-          <w:sz w:val="20"/>
-        </w:rPr>
-        <w:t>The Master Order Ledger records every commercial transaction across the platform, displaying current lifecycle status, purchasing customer, grower entity, order total in AUD, and full timestamp history.</w:t>
-      </w:r>
-    </w:p>
-    <w:p>
-      <w:pPr>
-        <w:spacing w:before="160" w:after="60"/>
-        <w:jc w:val="center"/>
-      </w:pPr>
-      <w:r>
-        <w:drawing>
-          <wp:inline xmlns:a="http://schemas.openxmlformats.org/drawingml/2006/main" xmlns:pic="http://schemas.openxmlformats.org/drawingml/2006/picture">
-            <wp:extent cx="5486400" cy="3587262"/>
-            <wp:docPr id="26" name="Picture 26"/>
-            <wp:cNvGraphicFramePr>
-              <a:graphicFrameLocks noChangeAspect="1"/>
-            </wp:cNvGraphicFramePr>
-            <a:graphic>
-              <a:graphicData uri="http://schemas.openxmlformats.org/drawingml/2006/picture">
-                <pic:pic>
-                  <pic:nvPicPr>
-                    <pic:cNvPr id="0" name="admin_05_orders.png"/>
-                    <pic:cNvPicPr/>
-                  </pic:nvPicPr>
-                  <pic:blipFill>
-                    <a:blip r:embed="rId36"/>
-                    <a:stretch>
-                      <a:fillRect/>
-                    </a:stretch>
-                  </pic:blipFill>
-                  <pic:spPr>
-                    <a:xfrm>
-                      <a:off x="0" y="0"/>
-                      <a:ext cx="5486400" cy="3587262"/>
-                    </a:xfrm>
-                    <a:prstGeom prst="rect"/>
-                  </pic:spPr>
-                </pic:pic>
-              </a:graphicData>
-            </a:graphic>
-          </wp:inline>
-        </w:drawing>
-      </w:r>
-    </w:p>
-    <w:p>
-      <w:pPr>
-        <w:spacing w:before="0" w:after="240"/>
-        <w:jc w:val="center"/>
-      </w:pPr>
-      <w:r>
-        <w:rPr>
-          <w:rFonts w:ascii="Calibri" w:hAnsi="Calibri"/>
-          <w:i/>
-          <w:color w:val="64748B"/>
-          <w:sz w:val="17"/>
-        </w:rPr>
-        <w:t>Figure: Figure 7.6: Master Supply Chain Transaction &amp; Custody Audit Ledger</w:t>
-      </w:r>
-    </w:p>
-    <w:p>
-      <w:pPr>
-        <w:keepNext/>
-        <w:spacing w:before="280" w:after="80"/>
-      </w:pPr>
-      <w:r>
-        <w:rPr>
-          <w:rFonts w:ascii="Calibri" w:hAnsi="Calibri"/>
-          <w:b/>
-          <w:color w:val="2E7D32"/>
-          <w:sz w:val="26"/>
-        </w:rPr>
-        <w:t>7.6 Commercial Evaluation &amp; Financial Telemetry (admin/evaluation.html)</w:t>
-      </w:r>
-    </w:p>
-    <w:p>
-      <w:pPr>
-        <w:spacing w:before="0" w:after="120" w:line="276" w:lineRule="auto"/>
-      </w:pPr>
-      <w:r>
-        <w:rPr>
-          <w:rFonts w:ascii="Calibri" w:hAnsi="Calibri"/>
-          <w:color w:val="1E293B"/>
-          <w:sz w:val="20"/>
-        </w:rPr>
-        <w:t>The administrative financial evaluation module analyzes platform profitability, operating expenditures, and serverless hosting fees against four primary commercial revenue streams:</w:t>
-      </w:r>
-    </w:p>
-    <w:p>
-      <w:pPr>
-        <w:pStyle w:val="ListBullet"/>
-        <w:spacing w:before="0" w:after="60" w:line="276" w:lineRule="auto"/>
-      </w:pPr>
-      <w:r>
-        <w:rPr>
-          <w:rFonts w:ascii="Calibri" w:hAnsi="Calibri"/>
-          <w:b/>
-          <w:color w:val="1E293B"/>
-          <w:sz w:val="20"/>
-        </w:rPr>
-        <w:t xml:space="preserve">1. </w:t>
-      </w:r>
-      <w:r>
-        <w:rPr>
-          <w:rFonts w:ascii="Calibri" w:hAnsi="Calibri"/>
-          <w:color w:val="1E293B"/>
-          <w:sz w:val="20"/>
-        </w:rPr>
-        <w:t>Commercial Wholesaler Accreditation Fee: $299 AUD annual audit certification.</w:t>
-      </w:r>
-    </w:p>
-    <w:p>
-      <w:pPr>
-        <w:pStyle w:val="ListBullet"/>
-        <w:spacing w:before="0" w:after="60" w:line="276" w:lineRule="auto"/>
-      </w:pPr>
-      <w:r>
-        <w:rPr>
-          <w:rFonts w:ascii="Calibri" w:hAnsi="Calibri"/>
-          <w:b/>
-          <w:color w:val="1E293B"/>
-          <w:sz w:val="20"/>
-        </w:rPr>
-        <w:t xml:space="preserve">2. </w:t>
-      </w:r>
-      <w:r>
-        <w:rPr>
-          <w:rFonts w:ascii="Calibri" w:hAnsi="Calibri"/>
-          <w:color w:val="1E293B"/>
-          <w:sz w:val="20"/>
-        </w:rPr>
-        <w:t>Farmer Cooperative SaaS Subscription: $49 AUD monthly farm management fee.</w:t>
-      </w:r>
-    </w:p>
-    <w:p>
-      <w:pPr>
-        <w:pStyle w:val="ListBullet"/>
-        <w:spacing w:before="0" w:after="60" w:line="276" w:lineRule="auto"/>
-      </w:pPr>
-      <w:r>
-        <w:rPr>
-          <w:rFonts w:ascii="Calibri" w:hAnsi="Calibri"/>
-          <w:b/>
-          <w:color w:val="1E293B"/>
-          <w:sz w:val="20"/>
-        </w:rPr>
-        <w:t xml:space="preserve">3. </w:t>
-      </w:r>
-      <w:r>
-        <w:rPr>
-          <w:rFonts w:ascii="Calibri" w:hAnsi="Calibri"/>
-          <w:color w:val="1E293B"/>
-          <w:sz w:val="20"/>
-        </w:rPr>
-        <w:t>Fair-Trade Transaction Commission: 3.5% transaction levy (compared to 50%+ duopoly markups).</w:t>
-      </w:r>
-    </w:p>
-    <w:p>
-      <w:pPr>
-        <w:pStyle w:val="ListBullet"/>
-        <w:spacing w:before="0" w:after="60" w:line="276" w:lineRule="auto"/>
-      </w:pPr>
-      <w:r>
-        <w:rPr>
-          <w:rFonts w:ascii="Calibri" w:hAnsi="Calibri"/>
-          <w:b/>
-          <w:color w:val="1E293B"/>
-          <w:sz w:val="20"/>
-        </w:rPr>
-        <w:t xml:space="preserve">4. </w:t>
-      </w:r>
-      <w:r>
-        <w:rPr>
-          <w:rFonts w:ascii="Calibri" w:hAnsi="Calibri"/>
-          <w:color w:val="1E293B"/>
-          <w:sz w:val="20"/>
-        </w:rPr>
-        <w:t>Enterprise Provenance API Access: $450 AUD monthly quota for institutional food distributors.</w:t>
-      </w:r>
-    </w:p>
-    <w:p>
-      <w:pPr>
-        <w:spacing w:before="160" w:after="60"/>
-        <w:jc w:val="center"/>
-      </w:pPr>
-      <w:r>
-        <w:drawing>
-          <wp:inline xmlns:a="http://schemas.openxmlformats.org/drawingml/2006/main" xmlns:pic="http://schemas.openxmlformats.org/drawingml/2006/picture">
-            <wp:extent cx="5486400" cy="3587262"/>
-            <wp:docPr id="27" name="Picture 27"/>
-            <wp:cNvGraphicFramePr>
-              <a:graphicFrameLocks noChangeAspect="1"/>
-            </wp:cNvGraphicFramePr>
-            <a:graphic>
-              <a:graphicData uri="http://schemas.openxmlformats.org/drawingml/2006/picture">
-                <pic:pic>
-                  <pic:nvPicPr>
-                    <pic:cNvPr id="0" name="admin_06_evaluation.png"/>
-                    <pic:cNvPicPr/>
-                  </pic:nvPicPr>
-                  <pic:blipFill>
-                    <a:blip r:embed="rId37"/>
-                    <a:stretch>
-                      <a:fillRect/>
-                    </a:stretch>
-                  </pic:blipFill>
-                  <pic:spPr>
-                    <a:xfrm>
-                      <a:off x="0" y="0"/>
-                      <a:ext cx="5486400" cy="3587262"/>
-                    </a:xfrm>
-                    <a:prstGeom prst="rect"/>
-                  </pic:spPr>
-                </pic:pic>
-              </a:graphicData>
-            </a:graphic>
-          </wp:inline>
-        </w:drawing>
-      </w:r>
-    </w:p>
-    <w:p>
-      <w:pPr>
-        <w:spacing w:before="0" w:after="240"/>
-        <w:jc w:val="center"/>
-      </w:pPr>
-      <w:r>
-        <w:rPr>
-          <w:rFonts w:ascii="Calibri" w:hAnsi="Calibri"/>
-          <w:i/>
-          <w:color w:val="64748B"/>
-          <w:sz w:val="17"/>
-        </w:rPr>
-        <w:t>Figure: Figure 7.7: Administrative Commercial Evaluation &amp; Operational Expenditure Telemetry</w:t>
+        <w:t>Figure: Figure 3.4: Multi-Module Administrative Governance Architecture</w:t>
       </w:r>
     </w:p>
     <w:p>
@@ -5082,7 +4455,7 @@
         <w:drawing>
           <wp:inline xmlns:a="http://schemas.openxmlformats.org/drawingml/2006/main" xmlns:pic="http://schemas.openxmlformats.org/drawingml/2006/picture">
             <wp:extent cx="5669280" cy="3644537"/>
-            <wp:docPr id="28" name="Picture 28"/>
+            <wp:docPr id="39" name="Picture 39"/>
             <wp:cNvGraphicFramePr>
               <a:graphicFrameLocks noChangeAspect="1"/>
             </wp:cNvGraphicFramePr>
@@ -5094,7 +4467,7 @@
                     <pic:cNvPicPr/>
                   </pic:nvPicPr>
                   <pic:blipFill>
-                    <a:blip r:embed="rId38"/>
+                    <a:blip r:embed="rId42"/>
                     <a:stretch>
                       <a:fillRect/>
                     </a:stretch>
@@ -5125,7 +4498,7 @@
           <w:color w:val="64748B"/>
           <w:sz w:val="17"/>
         </w:rPr>
-        <w:t>Figure: Figure 7.8: Commercial Revenue Flow &amp; Multi-Stream Monetization Model</w:t>
+        <w:t>Figure: Figure 3.5: Commercial Revenue Flow &amp; Multi-Stream Monetization Model</w:t>
       </w:r>
     </w:p>
     <w:p>
@@ -5140,20 +4513,7 @@
           <w:color w:val="1B4D20"/>
           <w:sz w:val="32"/>
         </w:rPr>
-        <w:t>8. Operational Troubleshooting &amp; Support Matrix</w:t>
-      </w:r>
-    </w:p>
-    <w:p>
-      <w:pPr>
-        <w:spacing w:before="0" w:after="120" w:line="276" w:lineRule="auto"/>
-      </w:pPr>
-      <w:r>
-        <w:rPr>
-          <w:rFonts w:ascii="Calibri" w:hAnsi="Calibri"/>
-          <w:color w:val="1E293B"/>
-          <w:sz w:val="20"/>
-        </w:rPr>
-        <w:t>This section outlines rapid diagnostic and corrective procedures for common operational scenarios encountered by platform users.</w:t>
+        <w:t>4. Operational Troubleshooting &amp; Support Matrix</w:t>
       </w:r>
     </w:p>
     <w:tbl>

</xml_diff>